<commit_message>
Se añade reflexión faltante
</commit_message>
<xml_diff>
--- a/Fase 1/Evidencias Individuales/Rodriguez_Mariana_1.2_APT122_DiarioReflexionFase1.docx
+++ b/Fase 1/Evidencias Individuales/Rodriguez_Mariana_1.2_APT122_DiarioReflexionFase1.docx
@@ -244,18 +244,6 @@
         </w:rPr>
       </w:pPr>
     </w:p>
-    <w:p>
-      <w:pPr>
-        <w:spacing w:after="0" w:line="360" w:lineRule="auto"/>
-        <w:jc w:val="both"/>
-        <w:rPr>
-          <w:b/>
-          <w:bCs/>
-          <w:sz w:val="24"/>
-          <w:szCs w:val="24"/>
-        </w:rPr>
-      </w:pPr>
-    </w:p>
     <w:tbl>
       <w:tblPr>
         <w:tblStyle w:val="Tablaconcuadrcula"/>
@@ -382,115 +370,7 @@
                 <w:szCs w:val="24"/>
                 <w:lang w:val="es-MX"/>
               </w:rPr>
-              <w:t xml:space="preserve">El certificado de modelamiento y </w:t>
-            </w:r>
-            <w:r>
-              <w:rPr>
-                <w:rFonts w:eastAsiaTheme="majorEastAsia"/>
-                <w:sz w:val="24"/>
-                <w:szCs w:val="24"/>
-                <w:lang w:val="es-MX"/>
-              </w:rPr>
-              <w:t>análisis</w:t>
-            </w:r>
-            <w:r>
-              <w:rPr>
-                <w:rFonts w:eastAsiaTheme="majorEastAsia"/>
-                <w:sz w:val="24"/>
-                <w:szCs w:val="24"/>
-                <w:lang w:val="es-MX"/>
-              </w:rPr>
-              <w:t xml:space="preserve"> de </w:t>
-            </w:r>
-            <w:r>
-              <w:rPr>
-                <w:rFonts w:eastAsiaTheme="majorEastAsia"/>
-                <w:sz w:val="24"/>
-                <w:szCs w:val="24"/>
-                <w:lang w:val="es-MX"/>
-              </w:rPr>
-              <w:t>datos</w:t>
-            </w:r>
-            <w:r>
-              <w:rPr>
-                <w:rFonts w:eastAsiaTheme="majorEastAsia"/>
-                <w:sz w:val="24"/>
-                <w:szCs w:val="24"/>
-                <w:lang w:val="es-MX"/>
-              </w:rPr>
-              <w:t xml:space="preserve"> se relaciona con mi </w:t>
-            </w:r>
-            <w:r>
-              <w:rPr>
-                <w:rFonts w:eastAsiaTheme="majorEastAsia"/>
-                <w:sz w:val="24"/>
-                <w:szCs w:val="24"/>
-                <w:lang w:val="es-MX"/>
-              </w:rPr>
-              <w:t>interés</w:t>
-            </w:r>
-            <w:r>
-              <w:rPr>
-                <w:rFonts w:eastAsiaTheme="majorEastAsia"/>
-                <w:sz w:val="24"/>
-                <w:szCs w:val="24"/>
-                <w:lang w:val="es-MX"/>
-              </w:rPr>
-              <w:t xml:space="preserve"> por las bases de datos, en un futuro me </w:t>
-            </w:r>
-            <w:r>
-              <w:rPr>
-                <w:rFonts w:eastAsiaTheme="majorEastAsia"/>
-                <w:sz w:val="24"/>
-                <w:szCs w:val="24"/>
-                <w:lang w:val="es-MX"/>
-              </w:rPr>
-              <w:t>gustaría</w:t>
-            </w:r>
-            <w:r>
-              <w:rPr>
-                <w:rFonts w:eastAsiaTheme="majorEastAsia"/>
-                <w:sz w:val="24"/>
-                <w:szCs w:val="24"/>
-                <w:lang w:val="es-MX"/>
-              </w:rPr>
-              <w:t xml:space="preserve"> trabajar como administradora de bases de datos y las competencias que he aprendido sobre esta </w:t>
-            </w:r>
-            <w:r>
-              <w:rPr>
-                <w:rFonts w:eastAsiaTheme="majorEastAsia"/>
-                <w:sz w:val="24"/>
-                <w:szCs w:val="24"/>
-                <w:lang w:val="es-MX"/>
-              </w:rPr>
-              <w:t>área</w:t>
-            </w:r>
-            <w:r>
-              <w:rPr>
-                <w:rFonts w:eastAsiaTheme="majorEastAsia"/>
-                <w:sz w:val="24"/>
-                <w:szCs w:val="24"/>
-                <w:lang w:val="es-MX"/>
-              </w:rPr>
-              <w:t xml:space="preserve"> me </w:t>
-            </w:r>
-            <w:r>
-              <w:rPr>
-                <w:rFonts w:eastAsiaTheme="majorEastAsia"/>
-                <w:sz w:val="24"/>
-                <w:szCs w:val="24"/>
-                <w:lang w:val="es-MX"/>
-              </w:rPr>
-              <w:t>permitirían</w:t>
-            </w:r>
-            <w:r>
-              <w:rPr>
-                <w:rFonts w:eastAsiaTheme="majorEastAsia"/>
-                <w:sz w:val="24"/>
-                <w:szCs w:val="24"/>
-                <w:lang w:val="es-MX"/>
-              </w:rPr>
-              <w:t xml:space="preserve"> desarrollarme perfectamente.</w:t>
+              <w:t>El certificado de modelamiento y análisis de datos se relaciona con mi interés por las bases de datos, en un futuro me gustaría trabajar como administradora de bases de datos y las competencias que he aprendido sobre esta área me permitirían desarrollarme perfectamente.</w:t>
             </w:r>
           </w:p>
           <w:p>
@@ -509,7 +389,7 @@
                 <w:szCs w:val="24"/>
                 <w:lang w:val="es-MX"/>
               </w:rPr>
-              <w:t xml:space="preserve">Lo que me ha gustado es la forma en la que se hace la </w:t>
+              <w:t xml:space="preserve">Lo que me ha gustado es la forma en la que se hace la estructuración y organización de los datos, es como resolver un </w:t>
             </w:r>
             <w:r>
               <w:rPr>
@@ -518,7 +398,7 @@
                 <w:szCs w:val="24"/>
                 <w:lang w:val="es-MX"/>
               </w:rPr>
-              <w:t>estructuración</w:t>
+              <w:t>rompecabezas,</w:t>
             </w:r>
             <w:r>
               <w:rPr>
@@ -527,169 +407,7 @@
                 <w:szCs w:val="24"/>
                 <w:lang w:val="es-MX"/>
               </w:rPr>
-              <w:t xml:space="preserve"> y </w:t>
-            </w:r>
-            <w:r>
-              <w:rPr>
-                <w:rFonts w:eastAsiaTheme="majorEastAsia"/>
-                <w:sz w:val="24"/>
-                <w:szCs w:val="24"/>
-                <w:lang w:val="es-MX"/>
-              </w:rPr>
-              <w:t>organización</w:t>
-            </w:r>
-            <w:r>
-              <w:rPr>
-                <w:rFonts w:eastAsiaTheme="majorEastAsia"/>
-                <w:sz w:val="24"/>
-                <w:szCs w:val="24"/>
-                <w:lang w:val="es-MX"/>
-              </w:rPr>
-              <w:t xml:space="preserve"> de los datos, es como resolver un </w:t>
-            </w:r>
-            <w:r>
-              <w:rPr>
-                <w:rFonts w:eastAsiaTheme="majorEastAsia"/>
-                <w:sz w:val="24"/>
-                <w:szCs w:val="24"/>
-                <w:lang w:val="es-MX"/>
-              </w:rPr>
-              <w:t>rompecabezas,</w:t>
-            </w:r>
-            <w:r>
-              <w:rPr>
-                <w:rFonts w:eastAsiaTheme="majorEastAsia"/>
-                <w:sz w:val="24"/>
-                <w:szCs w:val="24"/>
-                <w:lang w:val="es-MX"/>
-              </w:rPr>
-              <w:t xml:space="preserve"> cada pieza debe de encajar en su lugar para lograr darle </w:t>
-            </w:r>
-            <w:r>
-              <w:rPr>
-                <w:rFonts w:eastAsiaTheme="majorEastAsia"/>
-                <w:sz w:val="24"/>
-                <w:szCs w:val="24"/>
-                <w:lang w:val="es-MX"/>
-              </w:rPr>
-              <w:t>lógica</w:t>
-            </w:r>
-            <w:r>
-              <w:rPr>
-                <w:rFonts w:eastAsiaTheme="majorEastAsia"/>
-                <w:sz w:val="24"/>
-                <w:szCs w:val="24"/>
-                <w:lang w:val="es-MX"/>
-              </w:rPr>
-              <w:t xml:space="preserve"> y forma a la </w:t>
-            </w:r>
-            <w:r>
-              <w:rPr>
-                <w:rFonts w:eastAsiaTheme="majorEastAsia"/>
-                <w:sz w:val="24"/>
-                <w:szCs w:val="24"/>
-                <w:lang w:val="es-MX"/>
-              </w:rPr>
-              <w:t>información</w:t>
-            </w:r>
-            <w:r>
-              <w:rPr>
-                <w:rFonts w:eastAsiaTheme="majorEastAsia"/>
-                <w:sz w:val="24"/>
-                <w:szCs w:val="24"/>
-                <w:lang w:val="es-MX"/>
-              </w:rPr>
-              <w:t xml:space="preserve">, </w:t>
-            </w:r>
-            <w:r>
-              <w:rPr>
-                <w:rFonts w:eastAsiaTheme="majorEastAsia"/>
-                <w:sz w:val="24"/>
-                <w:szCs w:val="24"/>
-                <w:lang w:val="es-MX"/>
-              </w:rPr>
-              <w:t>también</w:t>
-            </w:r>
-            <w:r>
-              <w:rPr>
-                <w:rFonts w:eastAsiaTheme="majorEastAsia"/>
-                <w:sz w:val="24"/>
-                <w:szCs w:val="24"/>
-                <w:lang w:val="es-MX"/>
-              </w:rPr>
-              <w:t xml:space="preserve"> para lograr la </w:t>
-            </w:r>
-            <w:r>
-              <w:rPr>
-                <w:rFonts w:eastAsiaTheme="majorEastAsia"/>
-                <w:sz w:val="24"/>
-                <w:szCs w:val="24"/>
-                <w:lang w:val="es-MX"/>
-              </w:rPr>
-              <w:t>optimización</w:t>
-            </w:r>
-            <w:r>
-              <w:rPr>
-                <w:rFonts w:eastAsiaTheme="majorEastAsia"/>
-                <w:sz w:val="24"/>
-                <w:szCs w:val="24"/>
-                <w:lang w:val="es-MX"/>
-              </w:rPr>
-              <w:t xml:space="preserve"> y rendimiento en una base de datos hay que pensar en varias formas sobre </w:t>
-            </w:r>
-            <w:r>
-              <w:rPr>
-                <w:rFonts w:eastAsiaTheme="majorEastAsia"/>
-                <w:sz w:val="24"/>
-                <w:szCs w:val="24"/>
-                <w:lang w:val="es-MX"/>
-              </w:rPr>
-              <w:t>cómo</w:t>
-            </w:r>
-            <w:r>
-              <w:rPr>
-                <w:rFonts w:eastAsiaTheme="majorEastAsia"/>
-                <w:sz w:val="24"/>
-                <w:szCs w:val="24"/>
-                <w:lang w:val="es-MX"/>
-              </w:rPr>
-              <w:t xml:space="preserve"> hacer consultas eficientes, esto me lleva a manejar mucho la </w:t>
-            </w:r>
-            <w:r>
-              <w:rPr>
-                <w:rFonts w:eastAsiaTheme="majorEastAsia"/>
-                <w:sz w:val="24"/>
-                <w:szCs w:val="24"/>
-                <w:lang w:val="es-MX"/>
-              </w:rPr>
-              <w:t>lógica</w:t>
-            </w:r>
-            <w:r>
-              <w:rPr>
-                <w:rFonts w:eastAsiaTheme="majorEastAsia"/>
-                <w:sz w:val="24"/>
-                <w:szCs w:val="24"/>
-                <w:lang w:val="es-MX"/>
-              </w:rPr>
-              <w:t xml:space="preserve"> cosa que me </w:t>
-            </w:r>
-            <w:r>
-              <w:rPr>
-                <w:rFonts w:eastAsiaTheme="majorEastAsia"/>
-                <w:sz w:val="24"/>
-                <w:szCs w:val="24"/>
-                <w:lang w:val="es-MX"/>
-              </w:rPr>
-              <w:t>gusta bastante</w:t>
-            </w:r>
-            <w:r>
-              <w:rPr>
-                <w:rFonts w:eastAsiaTheme="majorEastAsia"/>
-                <w:sz w:val="24"/>
-                <w:szCs w:val="24"/>
-                <w:lang w:val="es-MX"/>
-              </w:rPr>
-              <w:t>.</w:t>
+              <w:t xml:space="preserve"> cada pieza debe de encajar en su lugar para lograr darle lógica y forma a la información, también para lograr la optimización y rendimiento en una base de datos hay que pensar en varias formas sobre cómo hacer consultas eficientes, esto me lleva a manejar mucho la lógica cosa que me gusta bastante.</w:t>
             </w:r>
           </w:p>
           <w:p>
@@ -715,79 +433,7 @@
                 <w:sz w:val="24"/>
                 <w:szCs w:val="24"/>
               </w:rPr>
-              <w:t>También</w:t>
-            </w:r>
-            <w:r>
-              <w:rPr>
-                <w:rFonts w:eastAsiaTheme="majorEastAsia"/>
-                <w:sz w:val="24"/>
-                <w:szCs w:val="24"/>
-              </w:rPr>
-              <w:t xml:space="preserve"> disfruté de</w:t>
-            </w:r>
-            <w:r>
-              <w:rPr>
-                <w:rFonts w:eastAsiaTheme="majorEastAsia"/>
-                <w:sz w:val="24"/>
-                <w:szCs w:val="24"/>
-              </w:rPr>
-              <w:t xml:space="preserve"> </w:t>
-            </w:r>
-            <w:r>
-              <w:rPr>
-                <w:rFonts w:eastAsiaTheme="majorEastAsia"/>
-                <w:sz w:val="24"/>
-                <w:szCs w:val="24"/>
-              </w:rPr>
-              <w:t xml:space="preserve">la asignatura </w:t>
-            </w:r>
-            <w:r>
-              <w:rPr>
-                <w:rFonts w:eastAsiaTheme="majorEastAsia"/>
-                <w:sz w:val="24"/>
-                <w:szCs w:val="24"/>
-              </w:rPr>
-              <w:t xml:space="preserve">optativa </w:t>
-            </w:r>
-            <w:r>
-              <w:rPr>
-                <w:rFonts w:eastAsiaTheme="majorEastAsia"/>
-                <w:sz w:val="24"/>
-                <w:szCs w:val="24"/>
-              </w:rPr>
-              <w:t xml:space="preserve">Soluciones Cloud con AWS. </w:t>
-            </w:r>
-            <w:r>
-              <w:rPr>
-                <w:rFonts w:eastAsiaTheme="majorEastAsia"/>
-                <w:sz w:val="24"/>
-                <w:szCs w:val="24"/>
-              </w:rPr>
-              <w:t>H</w:t>
-            </w:r>
-            <w:r>
-              <w:rPr>
-                <w:rFonts w:eastAsiaTheme="majorEastAsia"/>
-                <w:sz w:val="24"/>
-                <w:szCs w:val="24"/>
-              </w:rPr>
-              <w:t xml:space="preserve">oy </w:t>
-            </w:r>
-            <w:r>
-              <w:rPr>
-                <w:rFonts w:eastAsiaTheme="majorEastAsia"/>
-                <w:sz w:val="24"/>
-                <w:szCs w:val="24"/>
-              </w:rPr>
-              <w:t xml:space="preserve">lo </w:t>
-            </w:r>
-            <w:r>
-              <w:rPr>
-                <w:rFonts w:eastAsiaTheme="majorEastAsia"/>
-                <w:sz w:val="24"/>
-                <w:szCs w:val="24"/>
-              </w:rPr>
-              <w:t xml:space="preserve">aplico día a día en mi trabajo. Me </w:t>
+              <w:t xml:space="preserve">También disfruté de la asignatura optativa Soluciones Cloud con AWS. Hoy lo aplico día a día en mi trabajo. Me </w:t>
             </w:r>
             <w:r>
               <w:rPr>
@@ -803,55 +449,7 @@
                 <w:sz w:val="24"/>
                 <w:szCs w:val="24"/>
               </w:rPr>
-              <w:t xml:space="preserve"> aprender a analizar qué servicio elegir según la necesidad real, entender el modelo de costos y dimensionar el poder de cómputo. Más allá de la teoría, fue </w:t>
-            </w:r>
-            <w:r>
-              <w:rPr>
-                <w:rFonts w:eastAsiaTheme="majorEastAsia"/>
-                <w:sz w:val="24"/>
-                <w:szCs w:val="24"/>
-              </w:rPr>
-              <w:t xml:space="preserve">uno de los ramos que me </w:t>
-            </w:r>
-            <w:r>
-              <w:rPr>
-                <w:rFonts w:eastAsiaTheme="majorEastAsia"/>
-                <w:sz w:val="24"/>
-                <w:szCs w:val="24"/>
-              </w:rPr>
-              <w:t xml:space="preserve">motivó </w:t>
-            </w:r>
-            <w:r>
-              <w:rPr>
-                <w:rFonts w:eastAsiaTheme="majorEastAsia"/>
-                <w:sz w:val="24"/>
-                <w:szCs w:val="24"/>
-              </w:rPr>
-              <w:t>a</w:t>
-            </w:r>
-            <w:r>
-              <w:rPr>
-                <w:rFonts w:eastAsiaTheme="majorEastAsia"/>
-                <w:sz w:val="24"/>
-                <w:szCs w:val="24"/>
-              </w:rPr>
-              <w:t xml:space="preserve"> enfocar mi carrera </w:t>
-            </w:r>
-            <w:r>
-              <w:rPr>
-                <w:rFonts w:eastAsiaTheme="majorEastAsia"/>
-                <w:sz w:val="24"/>
-                <w:szCs w:val="24"/>
-              </w:rPr>
-              <w:t xml:space="preserve">en esa área </w:t>
-            </w:r>
-            <w:r>
-              <w:rPr>
-                <w:rFonts w:eastAsiaTheme="majorEastAsia"/>
-                <w:sz w:val="24"/>
-                <w:szCs w:val="24"/>
-              </w:rPr>
-              <w:t>para</w:t>
+              <w:t xml:space="preserve"> aprender a analizar qué servicio elegir según la necesidad real, entender el modelo de costos y dimensionar el poder de cómputo. Más allá de la teoría, fue uno de los ramos que me motivó a enfocar mi carrera en esa área para</w:t>
             </w:r>
             <w:r>
               <w:rPr>
@@ -884,59 +482,6 @@
             <w:pPr>
               <w:rPr>
                 <w:rFonts w:eastAsiaTheme="majorEastAsia"/>
-                <w:b/>
-                <w:bCs/>
-                <w:sz w:val="24"/>
-                <w:szCs w:val="24"/>
-              </w:rPr>
-            </w:pPr>
-            <w:r>
-              <w:rPr>
-                <w:rFonts w:eastAsiaTheme="majorEastAsia"/>
-                <w:b/>
-                <w:bCs/>
-                <w:sz w:val="24"/>
-                <w:szCs w:val="24"/>
-              </w:rPr>
-              <w:t>A partir de las c</w:t>
-            </w:r>
-            <w:r>
-              <w:rPr>
-                <w:rFonts w:eastAsiaTheme="majorEastAsia"/>
-                <w:b/>
-                <w:bCs/>
-                <w:sz w:val="24"/>
-                <w:szCs w:val="24"/>
-              </w:rPr>
-              <w:t>ertificaciones que obtienes a lo</w:t>
-            </w:r>
-            <w:r>
-              <w:rPr>
-                <w:rFonts w:eastAsiaTheme="majorEastAsia"/>
-                <w:b/>
-                <w:bCs/>
-                <w:sz w:val="24"/>
-                <w:szCs w:val="24"/>
-              </w:rPr>
-              <w:t xml:space="preserve"> largo de la carrera ¿Existe valor en la o las certificaciones obtenidas</w:t>
-            </w:r>
-            <w:r>
-              <w:rPr>
-                <w:rFonts w:eastAsiaTheme="majorEastAsia"/>
-                <w:b/>
-                <w:bCs/>
-                <w:sz w:val="24"/>
-                <w:szCs w:val="24"/>
-              </w:rPr>
-              <w:t>? ¿Por qué?</w:t>
-            </w:r>
-          </w:p>
-          <w:p>
-            <w:pPr>
-              <w:rPr>
-                <w:rFonts w:eastAsiaTheme="majorEastAsia"/>
-                <w:b/>
-                <w:bCs/>
                 <w:color w:val="767171" w:themeColor="background2" w:themeShade="80"/>
                 <w:sz w:val="24"/>
                 <w:szCs w:val="24"/>
@@ -947,6 +492,8 @@
             <w:pPr>
               <w:rPr>
                 <w:rFonts w:eastAsiaTheme="majorEastAsia"/>
+                <w:b/>
+                <w:bCs/>
                 <w:sz w:val="24"/>
                 <w:szCs w:val="24"/>
               </w:rPr>
@@ -954,48 +501,51 @@
             <w:r>
               <w:rPr>
                 <w:rFonts w:eastAsiaTheme="majorEastAsia"/>
-                <w:sz w:val="24"/>
-                <w:szCs w:val="24"/>
-              </w:rPr>
-              <w:t xml:space="preserve">Más allá del </w:t>
-            </w:r>
-            <w:r>
-              <w:rPr>
-                <w:rFonts w:eastAsiaTheme="majorEastAsia"/>
-                <w:sz w:val="24"/>
-                <w:szCs w:val="24"/>
-              </w:rPr>
-              <w:t>certificado digital o del</w:t>
-            </w:r>
-            <w:r>
-              <w:rPr>
-                <w:rFonts w:eastAsiaTheme="majorEastAsia"/>
-                <w:sz w:val="24"/>
-                <w:szCs w:val="24"/>
-              </w:rPr>
-              <w:t xml:space="preserve"> incluirlo directamente en </w:t>
-            </w:r>
-            <w:r>
-              <w:rPr>
-                <w:rFonts w:eastAsiaTheme="majorEastAsia"/>
-                <w:sz w:val="24"/>
-                <w:szCs w:val="24"/>
-              </w:rPr>
-              <w:t>un</w:t>
-            </w:r>
-            <w:r>
-              <w:rPr>
-                <w:rFonts w:eastAsiaTheme="majorEastAsia"/>
-                <w:sz w:val="24"/>
-                <w:szCs w:val="24"/>
-              </w:rPr>
-              <w:t xml:space="preserve"> CV, considero que el verdadero valor de estas certificaciones estuvo en el proceso para alcanzarlas. Representan hitos dentro de la carrera que me permitieron validar que iba adquiriendo las competencias necesarias para avanzar.</w:t>
+                <w:b/>
+                <w:bCs/>
+                <w:sz w:val="24"/>
+                <w:szCs w:val="24"/>
+              </w:rPr>
+              <w:t>A partir de las c</w:t>
+            </w:r>
+            <w:r>
+              <w:rPr>
+                <w:rFonts w:eastAsiaTheme="majorEastAsia"/>
+                <w:b/>
+                <w:bCs/>
+                <w:sz w:val="24"/>
+                <w:szCs w:val="24"/>
+              </w:rPr>
+              <w:t>ertificaciones que obtienes a lo</w:t>
+            </w:r>
+            <w:r>
+              <w:rPr>
+                <w:rFonts w:eastAsiaTheme="majorEastAsia"/>
+                <w:b/>
+                <w:bCs/>
+                <w:sz w:val="24"/>
+                <w:szCs w:val="24"/>
+              </w:rPr>
+              <w:t xml:space="preserve"> largo de la carrera ¿Existe valor en la o las certificaciones obtenidas</w:t>
+            </w:r>
+            <w:r>
+              <w:rPr>
+                <w:rFonts w:eastAsiaTheme="majorEastAsia"/>
+                <w:b/>
+                <w:bCs/>
+                <w:sz w:val="24"/>
+                <w:szCs w:val="24"/>
+              </w:rPr>
+              <w:t>? ¿Por qué?</w:t>
             </w:r>
           </w:p>
           <w:p>
             <w:pPr>
               <w:rPr>
                 <w:rFonts w:eastAsiaTheme="majorEastAsia"/>
+                <w:b/>
+                <w:bCs/>
+                <w:color w:val="767171" w:themeColor="background2" w:themeShade="80"/>
                 <w:sz w:val="24"/>
                 <w:szCs w:val="24"/>
               </w:rPr>
@@ -1015,55 +565,39 @@
                 <w:sz w:val="24"/>
                 <w:szCs w:val="24"/>
               </w:rPr>
-              <w:t xml:space="preserve">Por qué siendo </w:t>
-            </w:r>
-            <w:r>
-              <w:rPr>
-                <w:rFonts w:eastAsiaTheme="majorEastAsia"/>
-                <w:sz w:val="24"/>
-                <w:szCs w:val="24"/>
-              </w:rPr>
-              <w:t xml:space="preserve">clara, </w:t>
-            </w:r>
-            <w:r>
-              <w:rPr>
-                <w:rFonts w:eastAsiaTheme="majorEastAsia"/>
-                <w:sz w:val="24"/>
-                <w:szCs w:val="24"/>
-              </w:rPr>
-              <w:t>en</w:t>
-            </w:r>
-            <w:r>
-              <w:rPr>
-                <w:rFonts w:eastAsiaTheme="majorEastAsia"/>
-                <w:sz w:val="24"/>
-                <w:szCs w:val="24"/>
-              </w:rPr>
-              <w:t xml:space="preserve"> el mercado laboral pesan más las certificaciones oficiales de </w:t>
-            </w:r>
-            <w:r>
-              <w:rPr>
-                <w:rFonts w:eastAsiaTheme="majorEastAsia"/>
-                <w:sz w:val="24"/>
-                <w:szCs w:val="24"/>
-              </w:rPr>
-              <w:t>la</w:t>
-            </w:r>
-            <w:r>
-              <w:rPr>
-                <w:rFonts w:eastAsiaTheme="majorEastAsia"/>
-                <w:sz w:val="24"/>
-                <w:szCs w:val="24"/>
-              </w:rPr>
-              <w:t xml:space="preserve"> industria</w:t>
-            </w:r>
-            <w:r>
-              <w:rPr>
-                <w:rFonts w:eastAsiaTheme="majorEastAsia"/>
-                <w:sz w:val="24"/>
-                <w:szCs w:val="24"/>
-              </w:rPr>
-              <w:t xml:space="preserve">. </w:t>
+              <w:t xml:space="preserve">Más allá del </w:t>
+            </w:r>
+            <w:r>
+              <w:rPr>
+                <w:rFonts w:eastAsiaTheme="majorEastAsia"/>
+                <w:sz w:val="24"/>
+                <w:szCs w:val="24"/>
+              </w:rPr>
+              <w:t>certificado digital o del</w:t>
+            </w:r>
+            <w:r>
+              <w:rPr>
+                <w:rFonts w:eastAsiaTheme="majorEastAsia"/>
+                <w:sz w:val="24"/>
+                <w:szCs w:val="24"/>
+              </w:rPr>
+              <w:t xml:space="preserve"> incluirlo directamente en </w:t>
+            </w:r>
+            <w:r>
+              <w:rPr>
+                <w:rFonts w:eastAsiaTheme="majorEastAsia"/>
+                <w:sz w:val="24"/>
+                <w:szCs w:val="24"/>
+              </w:rPr>
+              <w:t>un</w:t>
+            </w:r>
+            <w:r>
+              <w:rPr>
+                <w:rFonts w:eastAsiaTheme="majorEastAsia"/>
+                <w:sz w:val="24"/>
+                <w:szCs w:val="24"/>
+              </w:rPr>
+              <w:t xml:space="preserve"> CV, considero que el verdadero valor de estas certificaciones estuvo en el proceso para alcanzarlas. Representan hitos dentro de la carrera que me permitieron validar que iba adquiriendo las competencias necesarias para avanzar.</w:t>
             </w:r>
           </w:p>
           <w:p>
@@ -1072,86 +606,126 @@
                 <w:rFonts w:eastAsiaTheme="majorEastAsia"/>
                 <w:sz w:val="24"/>
                 <w:szCs w:val="24"/>
-              </w:rPr>
-            </w:pPr>
-            <w:r>
-              <w:rPr>
-                <w:rFonts w:eastAsiaTheme="majorEastAsia"/>
-                <w:sz w:val="24"/>
-                <w:szCs w:val="24"/>
-              </w:rPr>
-              <w:t xml:space="preserve">Pero </w:t>
-            </w:r>
-            <w:r>
-              <w:rPr>
-                <w:rFonts w:eastAsiaTheme="majorEastAsia"/>
-                <w:sz w:val="24"/>
-                <w:szCs w:val="24"/>
-              </w:rPr>
-              <w:t xml:space="preserve">las de la carrera tuvieron el valor pedagógico de darme </w:t>
-            </w:r>
-            <w:r>
-              <w:rPr>
-                <w:rFonts w:eastAsiaTheme="majorEastAsia"/>
-                <w:sz w:val="24"/>
-                <w:szCs w:val="24"/>
-              </w:rPr>
-              <w:t xml:space="preserve">un plan </w:t>
-            </w:r>
-            <w:r>
-              <w:rPr>
-                <w:rFonts w:eastAsiaTheme="majorEastAsia"/>
-                <w:sz w:val="24"/>
-                <w:szCs w:val="24"/>
-              </w:rPr>
-              <w:t>estructura</w:t>
-            </w:r>
-            <w:r>
-              <w:rPr>
-                <w:rFonts w:eastAsiaTheme="majorEastAsia"/>
-                <w:sz w:val="24"/>
-                <w:szCs w:val="24"/>
-              </w:rPr>
-              <w:t>do.</w:t>
-            </w:r>
-          </w:p>
-          <w:p>
-            <w:pPr>
-              <w:jc w:val="both"/>
-              <w:rPr>
-                <w:rFonts w:ascii="Calibri" w:hAnsi="Calibri"/>
-                <w:b/>
-                <w:bCs/>
-                <w:color w:val="1F4E79" w:themeColor="accent1" w:themeShade="80"/>
               </w:rPr>
             </w:pPr>
           </w:p>
           <w:p>
             <w:pPr>
-              <w:jc w:val="both"/>
-              <w:rPr>
-                <w:rFonts w:ascii="Calibri" w:hAnsi="Calibri"/>
-                <w:b/>
-                <w:bCs/>
-                <w:color w:val="1F4E79" w:themeColor="accent1" w:themeShade="80"/>
+              <w:rPr>
+                <w:rFonts w:eastAsiaTheme="majorEastAsia"/>
+                <w:sz w:val="24"/>
+                <w:szCs w:val="24"/>
               </w:rPr>
             </w:pPr>
+            <w:r>
+              <w:rPr>
+                <w:rFonts w:eastAsiaTheme="majorEastAsia"/>
+                <w:sz w:val="24"/>
+                <w:szCs w:val="24"/>
+              </w:rPr>
+              <w:t xml:space="preserve">Por qué siendo </w:t>
+            </w:r>
+            <w:r>
+              <w:rPr>
+                <w:rFonts w:eastAsiaTheme="majorEastAsia"/>
+                <w:sz w:val="24"/>
+                <w:szCs w:val="24"/>
+              </w:rPr>
+              <w:t xml:space="preserve">clara, </w:t>
+            </w:r>
+            <w:r>
+              <w:rPr>
+                <w:rFonts w:eastAsiaTheme="majorEastAsia"/>
+                <w:sz w:val="24"/>
+                <w:szCs w:val="24"/>
+              </w:rPr>
+              <w:t>en</w:t>
+            </w:r>
+            <w:r>
+              <w:rPr>
+                <w:rFonts w:eastAsiaTheme="majorEastAsia"/>
+                <w:sz w:val="24"/>
+                <w:szCs w:val="24"/>
+              </w:rPr>
+              <w:t xml:space="preserve"> el mercado laboral pesan más las certificaciones oficiales de </w:t>
+            </w:r>
+            <w:r>
+              <w:rPr>
+                <w:rFonts w:eastAsiaTheme="majorEastAsia"/>
+                <w:sz w:val="24"/>
+                <w:szCs w:val="24"/>
+              </w:rPr>
+              <w:t>la</w:t>
+            </w:r>
+            <w:r>
+              <w:rPr>
+                <w:rFonts w:eastAsiaTheme="majorEastAsia"/>
+                <w:sz w:val="24"/>
+                <w:szCs w:val="24"/>
+              </w:rPr>
+              <w:t xml:space="preserve"> industria</w:t>
+            </w:r>
+            <w:r>
+              <w:rPr>
+                <w:rFonts w:eastAsiaTheme="majorEastAsia"/>
+                <w:sz w:val="24"/>
+                <w:szCs w:val="24"/>
+              </w:rPr>
+              <w:t xml:space="preserve">. </w:t>
+            </w:r>
+          </w:p>
+          <w:p>
+            <w:pPr>
+              <w:rPr>
+                <w:rFonts w:eastAsiaTheme="majorEastAsia"/>
+                <w:sz w:val="24"/>
+                <w:szCs w:val="24"/>
+              </w:rPr>
+            </w:pPr>
+            <w:r>
+              <w:rPr>
+                <w:rFonts w:eastAsiaTheme="majorEastAsia"/>
+                <w:sz w:val="24"/>
+                <w:szCs w:val="24"/>
+              </w:rPr>
+              <w:t xml:space="preserve">Pero </w:t>
+            </w:r>
+            <w:r>
+              <w:rPr>
+                <w:rFonts w:eastAsiaTheme="majorEastAsia"/>
+                <w:sz w:val="24"/>
+                <w:szCs w:val="24"/>
+              </w:rPr>
+              <w:t xml:space="preserve">las de la carrera tuvieron el valor pedagógico de darme </w:t>
+            </w:r>
+            <w:r>
+              <w:rPr>
+                <w:rFonts w:eastAsiaTheme="majorEastAsia"/>
+                <w:sz w:val="24"/>
+                <w:szCs w:val="24"/>
+              </w:rPr>
+              <w:t xml:space="preserve">un plan </w:t>
+            </w:r>
+            <w:r>
+              <w:rPr>
+                <w:rFonts w:eastAsiaTheme="majorEastAsia"/>
+                <w:sz w:val="24"/>
+                <w:szCs w:val="24"/>
+              </w:rPr>
+              <w:t>estructura</w:t>
+            </w:r>
+            <w:r>
+              <w:rPr>
+                <w:rFonts w:eastAsiaTheme="majorEastAsia"/>
+                <w:sz w:val="24"/>
+                <w:szCs w:val="24"/>
+              </w:rPr>
+              <w:t>do.</w:t>
+            </w:r>
           </w:p>
         </w:tc>
       </w:tr>
     </w:tbl>
-    <w:p>
-      <w:pPr>
-        <w:spacing w:after="0" w:line="360" w:lineRule="auto"/>
-        <w:jc w:val="both"/>
-        <w:rPr>
-          <w:color w:val="595959" w:themeColor="text1" w:themeTint="A6"/>
-          <w:sz w:val="24"/>
-          <w:szCs w:val="24"/>
-          <w:lang w:eastAsia="ja-JP"/>
-        </w:rPr>
-      </w:pPr>
-    </w:p>
     <w:p>
       <w:pPr>
         <w:spacing w:after="0" w:line="360" w:lineRule="auto"/>
@@ -1164,30 +738,804 @@
         </w:rPr>
       </w:pPr>
     </w:p>
-    <w:p>
-      <w:pPr>
-        <w:spacing w:after="0" w:line="360" w:lineRule="auto"/>
-        <w:jc w:val="both"/>
-        <w:rPr>
-          <w:b/>
-          <w:bCs/>
-          <w:sz w:val="24"/>
-          <w:szCs w:val="24"/>
-        </w:rPr>
-      </w:pPr>
-    </w:p>
-    <w:p>
-      <w:pPr>
-        <w:spacing w:after="0" w:line="360" w:lineRule="auto"/>
-        <w:jc w:val="both"/>
-        <w:rPr>
-          <w:b/>
-          <w:bCs/>
-          <w:sz w:val="24"/>
-          <w:szCs w:val="24"/>
-        </w:rPr>
-      </w:pPr>
-    </w:p>
+    <w:tbl>
+      <w:tblPr>
+        <w:tblStyle w:val="Tablaconcuadrcula"/>
+        <w:tblW w:w="0" w:type="auto"/>
+        <w:tblBorders>
+          <w:top w:val="single" w:sz="4" w:space="0" w:color="BFBFBF" w:themeColor="background1" w:themeShade="BF"/>
+          <w:left w:val="single" w:sz="4" w:space="0" w:color="BFBFBF" w:themeColor="background1" w:themeShade="BF"/>
+          <w:bottom w:val="single" w:sz="4" w:space="0" w:color="BFBFBF" w:themeColor="background1" w:themeShade="BF"/>
+          <w:right w:val="single" w:sz="4" w:space="0" w:color="BFBFBF" w:themeColor="background1" w:themeShade="BF"/>
+          <w:insideH w:val="single" w:sz="4" w:space="0" w:color="BFBFBF" w:themeColor="background1" w:themeShade="BF"/>
+          <w:insideV w:val="single" w:sz="4" w:space="0" w:color="BFBFBF" w:themeColor="background1" w:themeShade="BF"/>
+        </w:tblBorders>
+        <w:tblLook w:val="04A0" w:firstRow="1" w:lastRow="0" w:firstColumn="1" w:lastColumn="0" w:noHBand="0" w:noVBand="1"/>
+      </w:tblPr>
+      <w:tblGrid>
+        <w:gridCol w:w="10076"/>
+      </w:tblGrid>
+      <w:tr>
+        <w:trPr>
+          <w:trHeight w:val="440"/>
+        </w:trPr>
+        <w:tc>
+          <w:tcPr>
+            <w:tcW w:w="9918" w:type="dxa"/>
+            <w:vAlign w:val="center"/>
+          </w:tcPr>
+          <w:p>
+            <w:pPr>
+              <w:jc w:val="both"/>
+              <w:rPr>
+                <w:rFonts w:eastAsiaTheme="majorEastAsia"/>
+                <w:color w:val="767171" w:themeColor="background2" w:themeShade="80"/>
+                <w:sz w:val="24"/>
+                <w:szCs w:val="24"/>
+              </w:rPr>
+            </w:pPr>
+            <w:r>
+              <w:rPr>
+                <w:rFonts w:eastAsiaTheme="majorEastAsia"/>
+                <w:sz w:val="24"/>
+                <w:szCs w:val="24"/>
+              </w:rPr>
+              <w:t xml:space="preserve">2. Revisa las competencias y unidades de competencias correspondientes a cada asignatura de la malla de tu carrera. Marca en </w:t>
+            </w:r>
+            <w:r>
+              <w:rPr>
+                <w:rFonts w:eastAsiaTheme="majorEastAsia"/>
+                <w:b/>
+                <w:bCs/>
+                <w:color w:val="385623" w:themeColor="accent6" w:themeShade="80"/>
+                <w:sz w:val="24"/>
+                <w:szCs w:val="24"/>
+              </w:rPr>
+              <w:t>verde</w:t>
+            </w:r>
+            <w:r>
+              <w:rPr>
+                <w:rFonts w:eastAsiaTheme="majorEastAsia"/>
+                <w:color w:val="385623" w:themeColor="accent6" w:themeShade="80"/>
+                <w:sz w:val="24"/>
+                <w:szCs w:val="24"/>
+              </w:rPr>
+              <w:t xml:space="preserve"> </w:t>
+            </w:r>
+            <w:r>
+              <w:rPr>
+                <w:rFonts w:eastAsiaTheme="majorEastAsia"/>
+                <w:sz w:val="24"/>
+                <w:szCs w:val="24"/>
+              </w:rPr>
+              <w:t xml:space="preserve">las competencias o unidades de competencia que consideras son tus </w:t>
+            </w:r>
+            <w:r>
+              <w:rPr>
+                <w:rFonts w:eastAsiaTheme="majorEastAsia"/>
+                <w:b/>
+                <w:bCs/>
+                <w:color w:val="385623" w:themeColor="accent6" w:themeShade="80"/>
+                <w:sz w:val="24"/>
+                <w:szCs w:val="24"/>
+              </w:rPr>
+              <w:t>fortalezas</w:t>
+            </w:r>
+            <w:r>
+              <w:rPr>
+                <w:rFonts w:eastAsiaTheme="majorEastAsia"/>
+                <w:color w:val="385623" w:themeColor="accent6" w:themeShade="80"/>
+                <w:sz w:val="24"/>
+                <w:szCs w:val="24"/>
+              </w:rPr>
+              <w:t xml:space="preserve"> </w:t>
+            </w:r>
+            <w:r>
+              <w:rPr>
+                <w:rFonts w:eastAsiaTheme="majorEastAsia"/>
+                <w:sz w:val="24"/>
+                <w:szCs w:val="24"/>
+              </w:rPr>
+              <w:t xml:space="preserve">y en </w:t>
+            </w:r>
+            <w:r>
+              <w:rPr>
+                <w:rFonts w:eastAsiaTheme="majorEastAsia"/>
+                <w:b/>
+                <w:bCs/>
+                <w:color w:val="FF0000"/>
+                <w:sz w:val="24"/>
+                <w:szCs w:val="24"/>
+              </w:rPr>
+              <w:t>rojo</w:t>
+            </w:r>
+            <w:r>
+              <w:rPr>
+                <w:rFonts w:eastAsiaTheme="majorEastAsia"/>
+                <w:sz w:val="24"/>
+                <w:szCs w:val="24"/>
+              </w:rPr>
+              <w:t xml:space="preserve"> las que requieren ser fortalecidas. A partir de este ejercicio responde:</w:t>
+            </w:r>
+          </w:p>
+        </w:tc>
+      </w:tr>
+      <w:tr>
+        <w:trPr>
+          <w:trHeight w:val="440"/>
+        </w:trPr>
+        <w:tc>
+          <w:tcPr>
+            <w:tcW w:w="9918" w:type="dxa"/>
+            <w:shd w:val="clear" w:color="auto" w:fill="DEEAF6" w:themeFill="accent1" w:themeFillTint="33"/>
+            <w:vAlign w:val="center"/>
+          </w:tcPr>
+          <w:p>
+            <w:pPr>
+              <w:jc w:val="both"/>
+              <w:rPr>
+                <w:rFonts w:eastAsiaTheme="majorEastAsia"/>
+                <w:color w:val="767171" w:themeColor="background2" w:themeShade="80"/>
+                <w:sz w:val="24"/>
+                <w:szCs w:val="24"/>
+              </w:rPr>
+            </w:pPr>
+          </w:p>
+          <w:p>
+            <w:pPr>
+              <w:pStyle w:val="Prrafodelista"/>
+              <w:numPr>
+                <w:ilvl w:val="0"/>
+                <w:numId w:val="12"/>
+              </w:numPr>
+              <w:tabs>
+                <w:tab w:val="left" w:pos="454"/>
+              </w:tabs>
+              <w:ind w:left="454" w:hanging="283"/>
+              <w:jc w:val="both"/>
+              <w:rPr>
+                <w:rFonts w:eastAsiaTheme="majorEastAsia"/>
+                <w:b/>
+                <w:bCs/>
+                <w:color w:val="767171" w:themeColor="background2" w:themeShade="80"/>
+                <w:sz w:val="24"/>
+                <w:szCs w:val="24"/>
+              </w:rPr>
+            </w:pPr>
+            <w:r>
+              <w:rPr>
+                <w:rFonts w:eastAsiaTheme="majorEastAsia"/>
+                <w:b/>
+                <w:bCs/>
+                <w:sz w:val="24"/>
+                <w:szCs w:val="24"/>
+              </w:rPr>
+              <w:t xml:space="preserve">¿Cuáles consideras que tienes más desarrolladas y te sientes más seguro aplicando? ¿En cuáles te sientes más débil y requieren ser fortalecidas? </w:t>
+            </w:r>
+          </w:p>
+          <w:p>
+            <w:pPr>
+              <w:tabs>
+                <w:tab w:val="left" w:pos="454"/>
+              </w:tabs>
+              <w:jc w:val="both"/>
+              <w:rPr>
+                <w:rFonts w:eastAsiaTheme="majorEastAsia"/>
+                <w:color w:val="767171" w:themeColor="background2" w:themeShade="80"/>
+                <w:sz w:val="24"/>
+                <w:szCs w:val="24"/>
+              </w:rPr>
+            </w:pPr>
+            <w:r>
+              <w:rPr>
+                <w:rFonts w:eastAsiaTheme="majorEastAsia"/>
+                <w:color w:val="767171" w:themeColor="background2" w:themeShade="80"/>
+                <w:sz w:val="24"/>
+                <w:szCs w:val="24"/>
+              </w:rPr>
+              <w:drawing>
+                <wp:inline distT="0" distB="0" distL="0" distR="0" wp14:anchorId="318A3184" wp14:editId="1D9A6E6C">
+                  <wp:extent cx="6404610" cy="4938395"/>
+                  <wp:effectExtent l="0" t="0" r="0" b="0"/>
+                  <wp:docPr id="941272031" name="Imagen 1"/>
+                  <wp:cNvGraphicFramePr>
+                    <a:graphicFrameLocks xmlns:a="http://schemas.openxmlformats.org/drawingml/2006/main" noChangeAspect="1"/>
+                  </wp:cNvGraphicFramePr>
+                  <a:graphic xmlns:a="http://schemas.openxmlformats.org/drawingml/2006/main">
+                    <a:graphicData uri="http://schemas.openxmlformats.org/drawingml/2006/picture">
+                      <pic:pic xmlns:pic="http://schemas.openxmlformats.org/drawingml/2006/picture">
+                        <pic:nvPicPr>
+                          <pic:cNvPr id="941272031" name=""/>
+                          <pic:cNvPicPr/>
+                        </pic:nvPicPr>
+                        <pic:blipFill>
+                          <a:blip r:embed="rId12"/>
+                          <a:stretch>
+                            <a:fillRect/>
+                          </a:stretch>
+                        </pic:blipFill>
+                        <pic:spPr>
+                          <a:xfrm>
+                            <a:off x="0" y="0"/>
+                            <a:ext cx="6404610" cy="4938395"/>
+                          </a:xfrm>
+                          <a:prstGeom prst="rect">
+                            <a:avLst/>
+                          </a:prstGeom>
+                        </pic:spPr>
+                      </pic:pic>
+                    </a:graphicData>
+                  </a:graphic>
+                </wp:inline>
+              </w:drawing>
+            </w:r>
+          </w:p>
+          <w:p>
+            <w:pPr>
+              <w:tabs>
+                <w:tab w:val="left" w:pos="454"/>
+              </w:tabs>
+              <w:jc w:val="both"/>
+              <w:rPr>
+                <w:rFonts w:eastAsiaTheme="majorEastAsia"/>
+                <w:color w:val="767171" w:themeColor="background2" w:themeShade="80"/>
+                <w:sz w:val="24"/>
+                <w:szCs w:val="24"/>
+              </w:rPr>
+            </w:pPr>
+          </w:p>
+          <w:p>
+            <w:pPr>
+              <w:tabs>
+                <w:tab w:val="left" w:pos="454"/>
+              </w:tabs>
+              <w:jc w:val="both"/>
+              <w:rPr>
+                <w:rFonts w:eastAsiaTheme="majorEastAsia"/>
+                <w:color w:val="767171" w:themeColor="background2" w:themeShade="80"/>
+                <w:sz w:val="24"/>
+                <w:szCs w:val="24"/>
+              </w:rPr>
+            </w:pPr>
+          </w:p>
+          <w:p>
+            <w:pPr>
+              <w:tabs>
+                <w:tab w:val="left" w:pos="454"/>
+              </w:tabs>
+              <w:jc w:val="both"/>
+              <w:rPr>
+                <w:rFonts w:eastAsiaTheme="majorEastAsia"/>
+                <w:sz w:val="24"/>
+                <w:szCs w:val="24"/>
+              </w:rPr>
+            </w:pPr>
+            <w:r>
+              <w:rPr>
+                <w:rFonts w:eastAsiaTheme="majorEastAsia"/>
+                <w:sz w:val="24"/>
+                <w:szCs w:val="24"/>
+              </w:rPr>
+              <w:t xml:space="preserve">Diseño de Prototipos: Me siento muy cómoda en esta área porque soy una persona totalmente visual y me apasiona el diseño de interfaces. Disfruto aprender y trabajar con herramientas como Figma, complementándolas con </w:t>
+            </w:r>
+            <w:proofErr w:type="spellStart"/>
+            <w:r>
+              <w:rPr>
+                <w:rFonts w:eastAsiaTheme="majorEastAsia"/>
+                <w:sz w:val="24"/>
+                <w:szCs w:val="24"/>
+              </w:rPr>
+              <w:t>Canva</w:t>
+            </w:r>
+            <w:proofErr w:type="spellEnd"/>
+            <w:r>
+              <w:rPr>
+                <w:rFonts w:eastAsiaTheme="majorEastAsia"/>
+                <w:sz w:val="24"/>
+                <w:szCs w:val="24"/>
+              </w:rPr>
+              <w:t xml:space="preserve"> o Adobe. Me motiva buscar formas de crear entregables y pantallas que no solo sean visualmente atractivas, sino verdaderamente funcionales e intuitivas para el usuario final.</w:t>
+            </w:r>
+          </w:p>
+          <w:p>
+            <w:pPr>
+              <w:tabs>
+                <w:tab w:val="left" w:pos="454"/>
+              </w:tabs>
+              <w:jc w:val="both"/>
+              <w:rPr>
+                <w:rFonts w:eastAsiaTheme="majorEastAsia"/>
+                <w:sz w:val="24"/>
+                <w:szCs w:val="24"/>
+              </w:rPr>
+            </w:pPr>
+          </w:p>
+          <w:p>
+            <w:pPr>
+              <w:tabs>
+                <w:tab w:val="left" w:pos="454"/>
+              </w:tabs>
+              <w:jc w:val="both"/>
+              <w:rPr>
+                <w:rFonts w:eastAsiaTheme="majorEastAsia"/>
+                <w:sz w:val="24"/>
+                <w:szCs w:val="24"/>
+              </w:rPr>
+            </w:pPr>
+            <w:r>
+              <w:rPr>
+                <w:rFonts w:eastAsiaTheme="majorEastAsia"/>
+                <w:sz w:val="24"/>
+                <w:szCs w:val="24"/>
+              </w:rPr>
+              <w:lastRenderedPageBreak/>
+              <w:t>Bases de Datos: Trabajar con datos estructurados es algo que realmente me gusta. Me parece increíble la capacidad de gestionarlos, mantenerlos y transformar toda esa información centralizada en conocimiento útil para la toma de decisiones.</w:t>
+            </w:r>
+          </w:p>
+          <w:p>
+            <w:pPr>
+              <w:tabs>
+                <w:tab w:val="left" w:pos="454"/>
+              </w:tabs>
+              <w:jc w:val="both"/>
+              <w:rPr>
+                <w:rFonts w:eastAsiaTheme="majorEastAsia"/>
+                <w:sz w:val="24"/>
+                <w:szCs w:val="24"/>
+              </w:rPr>
+            </w:pPr>
+          </w:p>
+          <w:p>
+            <w:pPr>
+              <w:tabs>
+                <w:tab w:val="left" w:pos="454"/>
+              </w:tabs>
+              <w:jc w:val="both"/>
+              <w:rPr>
+                <w:rFonts w:eastAsiaTheme="majorEastAsia"/>
+                <w:sz w:val="24"/>
+                <w:szCs w:val="24"/>
+              </w:rPr>
+            </w:pPr>
+            <w:r>
+              <w:rPr>
+                <w:rFonts w:eastAsiaTheme="majorEastAsia"/>
+                <w:sz w:val="24"/>
+                <w:szCs w:val="24"/>
+              </w:rPr>
+              <w:t>Integración de Plataformas: Aprendí muchísimo sobre arquitecturas REST</w:t>
+            </w:r>
+            <w:r>
+              <w:rPr>
+                <w:rFonts w:eastAsiaTheme="majorEastAsia"/>
+                <w:sz w:val="24"/>
+                <w:szCs w:val="24"/>
+              </w:rPr>
+              <w:t>,</w:t>
+            </w:r>
+            <w:r>
+              <w:rPr>
+                <w:rFonts w:eastAsiaTheme="majorEastAsia"/>
+                <w:sz w:val="24"/>
+                <w:szCs w:val="24"/>
+              </w:rPr>
+              <w:t xml:space="preserve"> desde cómo estructurar y consumir APIs, hasta cómo implementarles seguridad. Me di cuenta de que es un tema que me entusiasma bastante, por lo que le dedico todo el empeño necesario para seguir profundizando.</w:t>
+            </w:r>
+          </w:p>
+          <w:p>
+            <w:pPr>
+              <w:tabs>
+                <w:tab w:val="left" w:pos="454"/>
+              </w:tabs>
+              <w:jc w:val="both"/>
+              <w:rPr>
+                <w:rFonts w:eastAsiaTheme="majorEastAsia"/>
+                <w:sz w:val="24"/>
+                <w:szCs w:val="24"/>
+              </w:rPr>
+            </w:pPr>
+          </w:p>
+          <w:p>
+            <w:pPr>
+              <w:tabs>
+                <w:tab w:val="left" w:pos="454"/>
+              </w:tabs>
+              <w:jc w:val="both"/>
+              <w:rPr>
+                <w:rFonts w:eastAsiaTheme="majorEastAsia"/>
+                <w:sz w:val="24"/>
+                <w:szCs w:val="24"/>
+              </w:rPr>
+            </w:pPr>
+            <w:r>
+              <w:rPr>
+                <w:rFonts w:eastAsiaTheme="majorEastAsia"/>
+                <w:sz w:val="24"/>
+                <w:szCs w:val="24"/>
+              </w:rPr>
+              <w:t>Gestión de Riesgos: Me gustaron mucho las metodologías aprendidas, en especial el análisis PESTEL. Lo encontré sumamente útil para observar, prever y evaluar riesgos desde distintas aristas, transformándolos en amenazas u oportunidades. Es algo que actualmente busco incorporar en mi entorno laboral.</w:t>
+            </w:r>
+          </w:p>
+          <w:p>
+            <w:pPr>
+              <w:tabs>
+                <w:tab w:val="left" w:pos="454"/>
+              </w:tabs>
+              <w:jc w:val="both"/>
+              <w:rPr>
+                <w:rFonts w:eastAsiaTheme="majorEastAsia"/>
+                <w:sz w:val="24"/>
+                <w:szCs w:val="24"/>
+              </w:rPr>
+            </w:pPr>
+          </w:p>
+          <w:p>
+            <w:pPr>
+              <w:tabs>
+                <w:tab w:val="left" w:pos="454"/>
+              </w:tabs>
+              <w:jc w:val="both"/>
+              <w:rPr>
+                <w:rFonts w:eastAsiaTheme="majorEastAsia"/>
+                <w:sz w:val="24"/>
+                <w:szCs w:val="24"/>
+              </w:rPr>
+            </w:pPr>
+            <w:r>
+              <w:rPr>
+                <w:rFonts w:eastAsiaTheme="majorEastAsia"/>
+                <w:sz w:val="24"/>
+                <w:szCs w:val="24"/>
+              </w:rPr>
+              <w:t xml:space="preserve">Inglés: Tengo buenas bases en el idioma, aunque reconozco que mi punto a reforzar es el </w:t>
+            </w:r>
+            <w:proofErr w:type="spellStart"/>
+            <w:r>
+              <w:rPr>
+                <w:rFonts w:eastAsiaTheme="majorEastAsia"/>
+                <w:sz w:val="24"/>
+                <w:szCs w:val="24"/>
+              </w:rPr>
+              <w:t>speaking</w:t>
+            </w:r>
+            <w:proofErr w:type="spellEnd"/>
+            <w:r>
+              <w:rPr>
+                <w:rFonts w:eastAsiaTheme="majorEastAsia"/>
+                <w:sz w:val="24"/>
+                <w:szCs w:val="24"/>
+              </w:rPr>
+              <w:t xml:space="preserve">. Es algo que he empezado a trabajar de forma activa recientemente, practicando un poco cada día con otras personas y en mi trabajo, aplicando active </w:t>
+            </w:r>
+            <w:proofErr w:type="spellStart"/>
+            <w:r>
+              <w:rPr>
+                <w:rFonts w:eastAsiaTheme="majorEastAsia"/>
+                <w:sz w:val="24"/>
+                <w:szCs w:val="24"/>
+              </w:rPr>
+              <w:t>recall</w:t>
+            </w:r>
+            <w:proofErr w:type="spellEnd"/>
+            <w:r>
+              <w:rPr>
+                <w:rFonts w:eastAsiaTheme="majorEastAsia"/>
+                <w:sz w:val="24"/>
+                <w:szCs w:val="24"/>
+              </w:rPr>
+              <w:t xml:space="preserve"> para ganar fluidez y hablar con mayor seguridad.</w:t>
+            </w:r>
+          </w:p>
+          <w:p>
+            <w:pPr>
+              <w:tabs>
+                <w:tab w:val="left" w:pos="454"/>
+              </w:tabs>
+              <w:jc w:val="both"/>
+              <w:rPr>
+                <w:rFonts w:eastAsiaTheme="majorEastAsia"/>
+                <w:sz w:val="24"/>
+                <w:szCs w:val="24"/>
+              </w:rPr>
+            </w:pPr>
+          </w:p>
+          <w:p>
+            <w:pPr>
+              <w:tabs>
+                <w:tab w:val="left" w:pos="454"/>
+              </w:tabs>
+              <w:jc w:val="both"/>
+              <w:rPr>
+                <w:rFonts w:eastAsiaTheme="majorEastAsia"/>
+                <w:sz w:val="24"/>
+                <w:szCs w:val="24"/>
+              </w:rPr>
+            </w:pPr>
+            <w:r>
+              <w:rPr>
+                <w:rFonts w:eastAsiaTheme="majorEastAsia"/>
+                <w:sz w:val="24"/>
+                <w:szCs w:val="24"/>
+              </w:rPr>
+              <w:t>Áreas que siento más débiles y requieren ser fortalecida</w:t>
+            </w:r>
+            <w:r>
+              <w:rPr>
+                <w:rFonts w:eastAsiaTheme="majorEastAsia"/>
+                <w:sz w:val="24"/>
+                <w:szCs w:val="24"/>
+              </w:rPr>
+              <w:t>s:</w:t>
+            </w:r>
+          </w:p>
+          <w:p>
+            <w:pPr>
+              <w:tabs>
+                <w:tab w:val="left" w:pos="454"/>
+              </w:tabs>
+              <w:jc w:val="both"/>
+              <w:rPr>
+                <w:rFonts w:eastAsiaTheme="majorEastAsia"/>
+                <w:sz w:val="24"/>
+                <w:szCs w:val="24"/>
+              </w:rPr>
+            </w:pPr>
+          </w:p>
+          <w:p>
+            <w:pPr>
+              <w:tabs>
+                <w:tab w:val="left" w:pos="454"/>
+              </w:tabs>
+              <w:jc w:val="both"/>
+              <w:rPr>
+                <w:rFonts w:eastAsiaTheme="majorEastAsia"/>
+                <w:sz w:val="24"/>
+                <w:szCs w:val="24"/>
+              </w:rPr>
+            </w:pPr>
+            <w:r>
+              <w:rPr>
+                <w:rFonts w:eastAsiaTheme="majorEastAsia"/>
+                <w:sz w:val="24"/>
+                <w:szCs w:val="24"/>
+              </w:rPr>
+              <w:t>BPM</w:t>
+            </w:r>
+            <w:r>
+              <w:rPr>
+                <w:rFonts w:eastAsiaTheme="majorEastAsia"/>
+                <w:sz w:val="24"/>
+                <w:szCs w:val="24"/>
+              </w:rPr>
+              <w:t xml:space="preserve">: </w:t>
+            </w:r>
+            <w:r>
+              <w:rPr>
+                <w:rFonts w:eastAsiaTheme="majorEastAsia"/>
+                <w:sz w:val="24"/>
+                <w:szCs w:val="24"/>
+              </w:rPr>
+              <w:t>Aunque me gustó el modelado y la diagramación, siento que me falta profundizar en el entendimiento del negocio. Necesito ir más allá de lo superficial para comprender los "dolores" reales, tanto de la empresa como de las personas que la hacen funcionar. Quiero reforzar esa mirada estratégica para trazar mapas y procesos alineados con lo que el negocio es y aspira a ser.</w:t>
+            </w:r>
+          </w:p>
+          <w:p>
+            <w:pPr>
+              <w:tabs>
+                <w:tab w:val="left" w:pos="454"/>
+              </w:tabs>
+              <w:jc w:val="both"/>
+              <w:rPr>
+                <w:rFonts w:eastAsiaTheme="majorEastAsia"/>
+                <w:sz w:val="24"/>
+                <w:szCs w:val="24"/>
+              </w:rPr>
+            </w:pPr>
+          </w:p>
+          <w:p>
+            <w:pPr>
+              <w:tabs>
+                <w:tab w:val="left" w:pos="454"/>
+              </w:tabs>
+              <w:jc w:val="both"/>
+              <w:rPr>
+                <w:rFonts w:eastAsiaTheme="majorEastAsia"/>
+                <w:sz w:val="24"/>
+                <w:szCs w:val="24"/>
+              </w:rPr>
+            </w:pPr>
+            <w:r>
+              <w:rPr>
+                <w:rFonts w:eastAsiaTheme="majorEastAsia"/>
+                <w:sz w:val="24"/>
+                <w:szCs w:val="24"/>
+              </w:rPr>
+              <w:t>Minería de Datos: Me fascinó la metodología CRISP-DM para ingeniería de datos y machine learning, pero reconozco su complejidad. Necesito fortalecer mis conocimientos en estadística avanzada y fórmulas complejas para comprender mejor cómo construir modelos predictivos realmente precisos.</w:t>
+            </w:r>
+          </w:p>
+          <w:p>
+            <w:pPr>
+              <w:tabs>
+                <w:tab w:val="left" w:pos="454"/>
+              </w:tabs>
+              <w:jc w:val="both"/>
+              <w:rPr>
+                <w:rFonts w:eastAsiaTheme="majorEastAsia"/>
+                <w:sz w:val="24"/>
+                <w:szCs w:val="24"/>
+              </w:rPr>
+            </w:pPr>
+          </w:p>
+          <w:p>
+            <w:pPr>
+              <w:tabs>
+                <w:tab w:val="left" w:pos="454"/>
+              </w:tabs>
+              <w:jc w:val="both"/>
+              <w:rPr>
+                <w:rFonts w:eastAsiaTheme="majorEastAsia"/>
+                <w:sz w:val="24"/>
+                <w:szCs w:val="24"/>
+              </w:rPr>
+            </w:pPr>
+            <w:r>
+              <w:rPr>
+                <w:rFonts w:eastAsiaTheme="majorEastAsia"/>
+                <w:sz w:val="24"/>
+                <w:szCs w:val="24"/>
+              </w:rPr>
+              <w:t>Herramientas y Mentalidad Emprendedora: Siento que me cuesta encontrar ideas verdaderamente innovadoras, disruptivas o rentables. Crear propuestas que perduren en el tiempo requiere "echarle mucha cabeza" y un nivel de creatividad enfocada al negocio que me gustaría seguir desarrollando.</w:t>
+            </w:r>
+          </w:p>
+          <w:p>
+            <w:pPr>
+              <w:tabs>
+                <w:tab w:val="left" w:pos="454"/>
+              </w:tabs>
+              <w:jc w:val="both"/>
+              <w:rPr>
+                <w:rFonts w:eastAsiaTheme="majorEastAsia"/>
+                <w:sz w:val="24"/>
+                <w:szCs w:val="24"/>
+              </w:rPr>
+            </w:pPr>
+          </w:p>
+          <w:p>
+            <w:pPr>
+              <w:tabs>
+                <w:tab w:val="left" w:pos="454"/>
+              </w:tabs>
+              <w:jc w:val="both"/>
+              <w:rPr>
+                <w:rFonts w:eastAsiaTheme="majorEastAsia"/>
+                <w:sz w:val="24"/>
+                <w:szCs w:val="24"/>
+              </w:rPr>
+            </w:pPr>
+            <w:r>
+              <w:rPr>
+                <w:rFonts w:eastAsiaTheme="majorEastAsia"/>
+                <w:sz w:val="24"/>
+                <w:szCs w:val="24"/>
+              </w:rPr>
+              <w:t>Arquitectura de Software: Comprendo que convertirse en Arquitecto de Soluciones exige un bagaje enorme</w:t>
+            </w:r>
+            <w:r>
+              <w:rPr>
+                <w:rFonts w:eastAsiaTheme="majorEastAsia"/>
+                <w:sz w:val="24"/>
+                <w:szCs w:val="24"/>
+              </w:rPr>
+              <w:t>, al</w:t>
+            </w:r>
+            <w:r>
+              <w:rPr>
+                <w:rFonts w:eastAsiaTheme="majorEastAsia"/>
+                <w:sz w:val="24"/>
+                <w:szCs w:val="24"/>
+              </w:rPr>
+              <w:t xml:space="preserve"> dominar programación, bases de datos, seguridad, </w:t>
+            </w:r>
+            <w:proofErr w:type="spellStart"/>
+            <w:r>
+              <w:rPr>
+                <w:rFonts w:eastAsiaTheme="majorEastAsia"/>
+                <w:sz w:val="24"/>
+                <w:szCs w:val="24"/>
+              </w:rPr>
+              <w:t>cloud</w:t>
+            </w:r>
+            <w:proofErr w:type="spellEnd"/>
+            <w:r>
+              <w:rPr>
+                <w:rFonts w:eastAsiaTheme="majorEastAsia"/>
+                <w:sz w:val="24"/>
+                <w:szCs w:val="24"/>
+              </w:rPr>
+              <w:t xml:space="preserve"> y más. Entiendo la importancia de articular todas estas ramas para diseñar proyectos robustos, pero siento que me falta recorrido y experiencia previa en cada una de ellas, por lo que hoy lo veo como un desafío a largo plazo más que como una aspiración inmediata.</w:t>
+            </w:r>
+          </w:p>
+          <w:p>
+            <w:pPr>
+              <w:tabs>
+                <w:tab w:val="left" w:pos="454"/>
+              </w:tabs>
+              <w:jc w:val="both"/>
+              <w:rPr>
+                <w:rFonts w:eastAsiaTheme="majorEastAsia"/>
+                <w:color w:val="767171" w:themeColor="background2" w:themeShade="80"/>
+                <w:sz w:val="24"/>
+                <w:szCs w:val="24"/>
+              </w:rPr>
+            </w:pPr>
+          </w:p>
+          <w:p>
+            <w:pPr>
+              <w:tabs>
+                <w:tab w:val="left" w:pos="454"/>
+              </w:tabs>
+              <w:jc w:val="both"/>
+              <w:rPr>
+                <w:rFonts w:eastAsiaTheme="majorEastAsia"/>
+                <w:color w:val="767171" w:themeColor="background2" w:themeShade="80"/>
+                <w:sz w:val="24"/>
+                <w:szCs w:val="24"/>
+              </w:rPr>
+            </w:pPr>
+          </w:p>
+          <w:p>
+            <w:pPr>
+              <w:jc w:val="both"/>
+              <w:rPr>
+                <w:rFonts w:ascii="Calibri" w:hAnsi="Calibri"/>
+                <w:b/>
+                <w:bCs/>
+              </w:rPr>
+            </w:pPr>
+          </w:p>
+          <w:p>
+            <w:pPr>
+              <w:jc w:val="both"/>
+              <w:rPr>
+                <w:rFonts w:ascii="Calibri" w:hAnsi="Calibri"/>
+                <w:b/>
+                <w:bCs/>
+              </w:rPr>
+            </w:pPr>
+          </w:p>
+          <w:p>
+            <w:pPr>
+              <w:jc w:val="both"/>
+              <w:rPr>
+                <w:rFonts w:ascii="Calibri" w:hAnsi="Calibri"/>
+                <w:b/>
+                <w:bCs/>
+              </w:rPr>
+            </w:pPr>
+          </w:p>
+          <w:p>
+            <w:pPr>
+              <w:jc w:val="both"/>
+              <w:rPr>
+                <w:rFonts w:ascii="Calibri" w:hAnsi="Calibri"/>
+                <w:b/>
+                <w:bCs/>
+              </w:rPr>
+            </w:pPr>
+          </w:p>
+          <w:p>
+            <w:pPr>
+              <w:jc w:val="both"/>
+              <w:rPr>
+                <w:rFonts w:ascii="Calibri" w:hAnsi="Calibri"/>
+                <w:b/>
+                <w:bCs/>
+                <w:color w:val="1F4E79" w:themeColor="accent1" w:themeShade="80"/>
+              </w:rPr>
+            </w:pPr>
+          </w:p>
+        </w:tc>
+      </w:tr>
+    </w:tbl>
     <w:p>
       <w:pPr>
         <w:spacing w:after="0" w:line="360" w:lineRule="auto"/>
@@ -1242,82 +1590,8 @@
                 <w:sz w:val="24"/>
                 <w:szCs w:val="24"/>
               </w:rPr>
-              <w:t xml:space="preserve">2. Revisa las competencias y unidades de competencias correspondientes a cada asignatura de la malla de tu carrera. Marca en </w:t>
-            </w:r>
-            <w:r>
-              <w:rPr>
-                <w:rFonts w:eastAsiaTheme="majorEastAsia"/>
-                <w:b/>
-                <w:bCs/>
-                <w:color w:val="385623" w:themeColor="accent6" w:themeShade="80"/>
-                <w:sz w:val="24"/>
-                <w:szCs w:val="24"/>
-              </w:rPr>
-              <w:t>verde</w:t>
-            </w:r>
-            <w:r>
-              <w:rPr>
-                <w:rFonts w:eastAsiaTheme="majorEastAsia"/>
-                <w:color w:val="385623" w:themeColor="accent6" w:themeShade="80"/>
-                <w:sz w:val="24"/>
-                <w:szCs w:val="24"/>
-              </w:rPr>
-              <w:t xml:space="preserve"> </w:t>
-            </w:r>
-            <w:r>
-              <w:rPr>
-                <w:rFonts w:eastAsiaTheme="majorEastAsia"/>
-                <w:sz w:val="24"/>
-                <w:szCs w:val="24"/>
-              </w:rPr>
-              <w:t xml:space="preserve">las competencias o unidades de competencia que consideras son tus </w:t>
-            </w:r>
-            <w:r>
-              <w:rPr>
-                <w:rFonts w:eastAsiaTheme="majorEastAsia"/>
-                <w:b/>
-                <w:bCs/>
-                <w:color w:val="385623" w:themeColor="accent6" w:themeShade="80"/>
-                <w:sz w:val="24"/>
-                <w:szCs w:val="24"/>
-              </w:rPr>
-              <w:t>fortalezas</w:t>
-            </w:r>
-            <w:r>
-              <w:rPr>
-                <w:rFonts w:eastAsiaTheme="majorEastAsia"/>
-                <w:color w:val="385623" w:themeColor="accent6" w:themeShade="80"/>
-                <w:sz w:val="24"/>
-                <w:szCs w:val="24"/>
-              </w:rPr>
-              <w:t xml:space="preserve"> </w:t>
-            </w:r>
-            <w:r>
-              <w:rPr>
-                <w:rFonts w:eastAsiaTheme="majorEastAsia"/>
-                <w:sz w:val="24"/>
-                <w:szCs w:val="24"/>
-              </w:rPr>
-              <w:t xml:space="preserve">y en </w:t>
-            </w:r>
-            <w:r>
-              <w:rPr>
-                <w:rFonts w:eastAsiaTheme="majorEastAsia"/>
-                <w:b/>
-                <w:bCs/>
-                <w:color w:val="FF0000"/>
-                <w:sz w:val="24"/>
-                <w:szCs w:val="24"/>
-              </w:rPr>
-              <w:t>rojo</w:t>
-            </w:r>
-            <w:r>
-              <w:rPr>
-                <w:rFonts w:eastAsiaTheme="majorEastAsia"/>
-                <w:sz w:val="24"/>
-                <w:szCs w:val="24"/>
-              </w:rPr>
-              <w:t xml:space="preserve"> las que requieren ser fortalecidas. A partir de este ejercicio responde:</w:t>
+              <w:lastRenderedPageBreak/>
+              <w:t>3. A partir de las respuestas anteriores y el perfil de egreso de tu carrera (competencias), responde las siguientes preguntas:</w:t>
             </w:r>
           </w:p>
         </w:tc>
@@ -1334,7 +1608,6 @@
           </w:tcPr>
           <w:p>
             <w:pPr>
-              <w:jc w:val="both"/>
               <w:rPr>
                 <w:rFonts w:eastAsiaTheme="majorEastAsia"/>
                 <w:color w:val="767171" w:themeColor="background2" w:themeShade="80"/>
@@ -1372,7 +1645,7 @@
                 <w:sz w:val="24"/>
                 <w:szCs w:val="24"/>
               </w:rPr>
-              <w:t xml:space="preserve">¿Cuáles consideras que tienes más desarrolladas y te sientes más seguro aplicando? ¿En cuáles te sientes más débil y requieren ser fortalecidas? </w:t>
+              <w:t>¿Cuáles son tus principales intereses profesionales? ¿Hay alguna área de desempeño que te interese más?</w:t>
             </w:r>
           </w:p>
           <w:p>
@@ -1397,6 +1670,171 @@
               <w:jc w:val="both"/>
               <w:rPr>
                 <w:rFonts w:eastAsiaTheme="majorEastAsia"/>
+                <w:sz w:val="24"/>
+                <w:szCs w:val="24"/>
+                <w:lang w:val="es-MX"/>
+              </w:rPr>
+            </w:pPr>
+            <w:r>
+              <w:rPr>
+                <w:rFonts w:eastAsiaTheme="majorEastAsia"/>
+                <w:sz w:val="24"/>
+                <w:szCs w:val="24"/>
+                <w:lang w:val="es-MX"/>
+              </w:rPr>
+              <w:t xml:space="preserve">Programación web y desarrollo de prototipos, en programación web aprendí bastante y me di cuenta de que me gusta mucho crear la estructura de las páginas web con </w:t>
+            </w:r>
+            <w:proofErr w:type="spellStart"/>
+            <w:r>
+              <w:rPr>
+                <w:rFonts w:eastAsiaTheme="majorEastAsia"/>
+                <w:sz w:val="24"/>
+                <w:szCs w:val="24"/>
+                <w:lang w:val="es-MX"/>
+              </w:rPr>
+              <w:t>html</w:t>
+            </w:r>
+            <w:proofErr w:type="spellEnd"/>
+            <w:r>
+              <w:rPr>
+                <w:rFonts w:eastAsiaTheme="majorEastAsia"/>
+                <w:sz w:val="24"/>
+                <w:szCs w:val="24"/>
+                <w:lang w:val="es-MX"/>
+              </w:rPr>
+              <w:t xml:space="preserve"> y darle el comportamiento con otros </w:t>
+            </w:r>
+            <w:r>
+              <w:rPr>
+                <w:rFonts w:eastAsiaTheme="majorEastAsia"/>
+                <w:sz w:val="24"/>
+                <w:szCs w:val="24"/>
+                <w:lang w:val="es-MX"/>
+              </w:rPr>
+              <w:t>lenguajes</w:t>
+            </w:r>
+            <w:r>
+              <w:rPr>
+                <w:rFonts w:eastAsiaTheme="majorEastAsia"/>
+                <w:sz w:val="24"/>
+                <w:szCs w:val="24"/>
+                <w:lang w:val="es-MX"/>
+              </w:rPr>
+              <w:t>, también en el área de bases de datos relacionales me siento segura al realizar operaciones como son las consultas, el modelado de datos...</w:t>
+            </w:r>
+          </w:p>
+          <w:p>
+            <w:pPr>
+              <w:tabs>
+                <w:tab w:val="left" w:pos="454"/>
+              </w:tabs>
+              <w:jc w:val="both"/>
+              <w:rPr>
+                <w:rFonts w:eastAsiaTheme="majorEastAsia"/>
+                <w:sz w:val="24"/>
+                <w:szCs w:val="24"/>
+                <w:lang w:val="es-MX"/>
+              </w:rPr>
+            </w:pPr>
+            <w:r>
+              <w:rPr>
+                <w:rFonts w:eastAsiaTheme="majorEastAsia"/>
+                <w:sz w:val="24"/>
+                <w:szCs w:val="24"/>
+                <w:lang w:val="es-MX"/>
+              </w:rPr>
+              <w:t>También me interesa muchísimo el desarrollo de prototipos, en especial la herramienta</w:t>
+            </w:r>
+            <w:r>
+              <w:rPr>
+                <w:rFonts w:eastAsiaTheme="majorEastAsia"/>
+                <w:sz w:val="24"/>
+                <w:szCs w:val="24"/>
+                <w:lang w:val="es-MX"/>
+              </w:rPr>
+              <w:t xml:space="preserve"> </w:t>
+            </w:r>
+            <w:r>
+              <w:rPr>
+                <w:rFonts w:eastAsiaTheme="majorEastAsia"/>
+                <w:sz w:val="24"/>
+                <w:szCs w:val="24"/>
+                <w:lang w:val="es-MX"/>
+              </w:rPr>
+              <w:t>Figma</w:t>
+            </w:r>
+            <w:r>
+              <w:rPr>
+                <w:rFonts w:eastAsiaTheme="majorEastAsia"/>
+                <w:sz w:val="24"/>
+                <w:szCs w:val="24"/>
+                <w:lang w:val="es-MX"/>
+              </w:rPr>
+              <w:t xml:space="preserve">, </w:t>
+            </w:r>
+            <w:r>
+              <w:rPr>
+                <w:rFonts w:eastAsiaTheme="majorEastAsia"/>
+                <w:sz w:val="24"/>
+                <w:szCs w:val="24"/>
+                <w:lang w:val="es-MX"/>
+              </w:rPr>
+              <w:t>considero</w:t>
+            </w:r>
+            <w:r>
+              <w:rPr>
+                <w:rFonts w:eastAsiaTheme="majorEastAsia"/>
+                <w:sz w:val="24"/>
+                <w:szCs w:val="24"/>
+                <w:lang w:val="es-MX"/>
+              </w:rPr>
+              <w:t xml:space="preserve"> que tengo sentido del diseño y a la vez objetividad, pues la idea de crear estos prototipos es basarse en que funciona para el usuario, en proveerle diseños atractivos y que </w:t>
+            </w:r>
+            <w:r>
+              <w:rPr>
+                <w:rFonts w:eastAsiaTheme="majorEastAsia"/>
+                <w:sz w:val="24"/>
+                <w:szCs w:val="24"/>
+                <w:lang w:val="es-MX"/>
+              </w:rPr>
+              <w:t>sean intuitivos</w:t>
+            </w:r>
+            <w:r>
+              <w:rPr>
+                <w:rFonts w:eastAsiaTheme="majorEastAsia"/>
+                <w:sz w:val="24"/>
+                <w:szCs w:val="24"/>
+                <w:lang w:val="es-MX"/>
+              </w:rPr>
+              <w:t xml:space="preserve"> para poder ser usados </w:t>
+            </w:r>
+            <w:r>
+              <w:rPr>
+                <w:rFonts w:eastAsiaTheme="majorEastAsia"/>
+                <w:sz w:val="24"/>
+                <w:szCs w:val="24"/>
+                <w:lang w:val="es-MX"/>
+              </w:rPr>
+              <w:t>fácilmente</w:t>
+            </w:r>
+            <w:r>
+              <w:rPr>
+                <w:rFonts w:eastAsiaTheme="majorEastAsia"/>
+                <w:sz w:val="24"/>
+                <w:szCs w:val="24"/>
+                <w:lang w:val="es-MX"/>
+              </w:rPr>
+              <w:t>.</w:t>
+            </w:r>
+          </w:p>
+          <w:p>
+            <w:pPr>
+              <w:tabs>
+                <w:tab w:val="left" w:pos="454"/>
+              </w:tabs>
+              <w:jc w:val="both"/>
+              <w:rPr>
+                <w:rFonts w:eastAsiaTheme="majorEastAsia"/>
                 <w:color w:val="767171" w:themeColor="background2" w:themeShade="80"/>
                 <w:sz w:val="24"/>
                 <w:szCs w:val="24"/>
@@ -1419,12 +1857,48 @@
           </w:p>
           <w:p>
             <w:pPr>
+              <w:pStyle w:val="Prrafodelista"/>
+              <w:numPr>
+                <w:ilvl w:val="0"/>
+                <w:numId w:val="12"/>
+              </w:numPr>
               <w:tabs>
                 <w:tab w:val="left" w:pos="454"/>
               </w:tabs>
+              <w:ind w:left="454" w:hanging="283"/>
               <w:jc w:val="both"/>
               <w:rPr>
                 <w:rFonts w:eastAsiaTheme="majorEastAsia"/>
+                <w:b/>
+                <w:bCs/>
+                <w:color w:val="767171" w:themeColor="background2" w:themeShade="80"/>
+                <w:sz w:val="24"/>
+                <w:szCs w:val="24"/>
+              </w:rPr>
+            </w:pPr>
+            <w:r>
+              <w:rPr>
+                <w:rFonts w:eastAsiaTheme="majorEastAsia"/>
+                <w:b/>
+                <w:bCs/>
+                <w:sz w:val="24"/>
+                <w:szCs w:val="24"/>
+              </w:rPr>
+              <w:t>¿Cuáles son las principales competencias que se relacionan con tus intereses profesionales? ¿Hay alguna de ellas que sientas que requieres especialmente fortalecer?</w:t>
+            </w:r>
+          </w:p>
+          <w:p>
+            <w:pPr>
+              <w:pStyle w:val="Prrafodelista"/>
+              <w:tabs>
+                <w:tab w:val="left" w:pos="454"/>
+              </w:tabs>
+              <w:ind w:left="454"/>
+              <w:jc w:val="both"/>
+              <w:rPr>
+                <w:rFonts w:eastAsiaTheme="majorEastAsia"/>
+                <w:b/>
+                <w:bCs/>
                 <w:color w:val="767171" w:themeColor="background2" w:themeShade="80"/>
                 <w:sz w:val="24"/>
                 <w:szCs w:val="24"/>
@@ -1439,7 +1913,27 @@
               <w:jc w:val="both"/>
               <w:rPr>
                 <w:rFonts w:eastAsiaTheme="majorEastAsia"/>
-                <w:color w:val="767171" w:themeColor="background2" w:themeShade="80"/>
+                <w:sz w:val="24"/>
+                <w:szCs w:val="24"/>
+              </w:rPr>
+            </w:pPr>
+            <w:r>
+              <w:rPr>
+                <w:rFonts w:eastAsiaTheme="majorEastAsia"/>
+                <w:sz w:val="24"/>
+                <w:szCs w:val="24"/>
+              </w:rPr>
+              <w:t>Las competencias que más se conectan con mis intereses son el Diseño de Soluciones de Software y la Gestión de Bases de Datos, especialmente por cómo se vinculan con el ecosistema Cloud y el sector Fintech, que es donde quiero proyectarme.</w:t>
+            </w:r>
+          </w:p>
+          <w:p>
+            <w:pPr>
+              <w:tabs>
+                <w:tab w:val="left" w:pos="454"/>
+              </w:tabs>
+              <w:jc w:val="both"/>
+              <w:rPr>
+                <w:rFonts w:eastAsiaTheme="majorEastAsia"/>
                 <w:sz w:val="24"/>
                 <w:szCs w:val="24"/>
               </w:rPr>
@@ -1453,6 +1947,59 @@
               <w:jc w:val="both"/>
               <w:rPr>
                 <w:rFonts w:eastAsiaTheme="majorEastAsia"/>
+                <w:sz w:val="24"/>
+                <w:szCs w:val="24"/>
+              </w:rPr>
+            </w:pPr>
+            <w:r>
+              <w:rPr>
+                <w:rFonts w:eastAsiaTheme="majorEastAsia"/>
+                <w:sz w:val="24"/>
+                <w:szCs w:val="24"/>
+              </w:rPr>
+              <w:t xml:space="preserve">Sin embargo, la competencia que siento que requiero fortalecer especialmente es la de </w:t>
+            </w:r>
+            <w:r>
+              <w:rPr>
+                <w:rFonts w:eastAsiaTheme="majorEastAsia"/>
+                <w:sz w:val="24"/>
+                <w:szCs w:val="24"/>
+              </w:rPr>
+              <w:t xml:space="preserve">Mentalidad emprendedora, no </w:t>
+            </w:r>
+            <w:r>
+              <w:rPr>
+                <w:rFonts w:eastAsiaTheme="majorEastAsia"/>
+                <w:sz w:val="24"/>
+                <w:szCs w:val="24"/>
+              </w:rPr>
+              <w:t>me basta con dominar la parte técnica</w:t>
+            </w:r>
+            <w:r>
+              <w:rPr>
+                <w:rFonts w:eastAsiaTheme="majorEastAsia"/>
+                <w:sz w:val="24"/>
+                <w:szCs w:val="24"/>
+              </w:rPr>
+              <w:t>,</w:t>
+            </w:r>
+            <w:r>
+              <w:rPr>
+                <w:rFonts w:eastAsiaTheme="majorEastAsia"/>
+                <w:sz w:val="24"/>
+                <w:szCs w:val="24"/>
+              </w:rPr>
+              <w:t xml:space="preserve"> necesito aprender a salir de mi zona de confort, tomar decisiones estratégicas sin depender de fórmulas preestablecidas y gestionar un proyecto con la audacia que exige el trabajo independiente.</w:t>
+            </w:r>
+          </w:p>
+          <w:p>
+            <w:pPr>
+              <w:tabs>
+                <w:tab w:val="left" w:pos="454"/>
+              </w:tabs>
+              <w:jc w:val="both"/>
+              <w:rPr>
+                <w:rFonts w:eastAsiaTheme="majorEastAsia"/>
                 <w:color w:val="767171" w:themeColor="background2" w:themeShade="80"/>
                 <w:sz w:val="24"/>
                 <w:szCs w:val="24"/>
@@ -1475,6 +2022,38 @@
           </w:p>
           <w:p>
             <w:pPr>
+              <w:pStyle w:val="Prrafodelista"/>
+              <w:numPr>
+                <w:ilvl w:val="0"/>
+                <w:numId w:val="12"/>
+              </w:numPr>
+              <w:tabs>
+                <w:tab w:val="left" w:pos="454"/>
+              </w:tabs>
+              <w:ind w:left="454" w:hanging="283"/>
+              <w:jc w:val="both"/>
+              <w:rPr>
+                <w:rFonts w:eastAsiaTheme="majorEastAsia"/>
+                <w:b/>
+                <w:bCs/>
+                <w:color w:val="767171" w:themeColor="background2" w:themeShade="80"/>
+                <w:sz w:val="24"/>
+                <w:szCs w:val="24"/>
+              </w:rPr>
+            </w:pPr>
+            <w:r>
+              <w:rPr>
+                <w:rFonts w:eastAsiaTheme="majorEastAsia"/>
+                <w:b/>
+                <w:bCs/>
+                <w:sz w:val="24"/>
+                <w:szCs w:val="24"/>
+              </w:rPr>
+              <w:t>¿Cómo te gustaría que fuera tu escenario laboral en 5 años más? ¿Qué te gustaría estar haciendo?</w:t>
+            </w:r>
+          </w:p>
+          <w:p>
+            <w:pPr>
               <w:tabs>
                 <w:tab w:val="left" w:pos="454"/>
               </w:tabs>
@@ -1495,24 +2074,71 @@
               <w:jc w:val="both"/>
               <w:rPr>
                 <w:rFonts w:eastAsiaTheme="majorEastAsia"/>
-                <w:color w:val="767171" w:themeColor="background2" w:themeShade="80"/>
                 <w:sz w:val="24"/>
                 <w:szCs w:val="24"/>
               </w:rPr>
             </w:pPr>
+            <w:r>
+              <w:rPr>
+                <w:rFonts w:eastAsiaTheme="majorEastAsia"/>
+                <w:sz w:val="24"/>
+                <w:szCs w:val="24"/>
+              </w:rPr>
+              <w:t xml:space="preserve">A futuro, quiero desarrollarme en el sector Fintech y profundizar en las áreas que más me apasionan: arquitectura </w:t>
+            </w:r>
+            <w:proofErr w:type="spellStart"/>
+            <w:r>
+              <w:rPr>
+                <w:rFonts w:eastAsiaTheme="majorEastAsia"/>
+                <w:sz w:val="24"/>
+                <w:szCs w:val="24"/>
+              </w:rPr>
+              <w:t>cloud</w:t>
+            </w:r>
+            <w:proofErr w:type="spellEnd"/>
+            <w:r>
+              <w:rPr>
+                <w:rFonts w:eastAsiaTheme="majorEastAsia"/>
+                <w:sz w:val="24"/>
+                <w:szCs w:val="24"/>
+              </w:rPr>
+              <w:t xml:space="preserve">, ciberseguridad, programación, bases de datos y diseño. Mi meta es dominar a fondo una de estas especialidades para aportar con un alto nivel técnico en proyectos de impacto. A largo plazo, busco construir mi camino como </w:t>
+            </w:r>
+            <w:proofErr w:type="spellStart"/>
+            <w:r>
+              <w:rPr>
+                <w:rFonts w:eastAsiaTheme="majorEastAsia"/>
+                <w:sz w:val="24"/>
+                <w:szCs w:val="24"/>
+              </w:rPr>
+              <w:t>freelancer</w:t>
+            </w:r>
+            <w:proofErr w:type="spellEnd"/>
+            <w:r>
+              <w:rPr>
+                <w:rFonts w:eastAsiaTheme="majorEastAsia"/>
+                <w:sz w:val="24"/>
+                <w:szCs w:val="24"/>
+              </w:rPr>
+              <w:t xml:space="preserve">, </w:t>
+            </w:r>
+            <w:r>
+              <w:rPr>
+                <w:rFonts w:eastAsiaTheme="majorEastAsia"/>
+                <w:sz w:val="24"/>
+                <w:szCs w:val="24"/>
+              </w:rPr>
+              <w:t>sé que requiere gran disciplina y trabajo, pero me motiva ser mi propia jefa y dejar una marca de calidad y compromiso en cada proyecto que entregue.</w:t>
+            </w:r>
           </w:p>
           <w:p>
             <w:pPr>
-              <w:tabs>
-                <w:tab w:val="left" w:pos="454"/>
-              </w:tabs>
-              <w:ind w:left="171"/>
               <w:jc w:val="both"/>
               <w:rPr>
-                <w:rFonts w:eastAsiaTheme="majorEastAsia"/>
-                <w:color w:val="767171" w:themeColor="background2" w:themeShade="80"/>
-                <w:sz w:val="24"/>
-                <w:szCs w:val="24"/>
+                <w:rFonts w:ascii="Calibri" w:hAnsi="Calibri"/>
+                <w:b/>
+                <w:bCs/>
+                <w:color w:val="1F4E79" w:themeColor="accent1" w:themeShade="80"/>
               </w:rPr>
             </w:pPr>
           </w:p>
@@ -1520,77 +2146,6 @@
             <w:pPr>
               <w:jc w:val="both"/>
               <w:rPr>
-                <w:rFonts w:eastAsiaTheme="majorEastAsia"/>
-                <w:color w:val="767171" w:themeColor="background2" w:themeShade="80"/>
-                <w:sz w:val="24"/>
-                <w:szCs w:val="24"/>
-              </w:rPr>
-            </w:pPr>
-          </w:p>
-          <w:p>
-            <w:pPr>
-              <w:jc w:val="both"/>
-              <w:rPr>
-                <w:rFonts w:ascii="Calibri" w:hAnsi="Calibri"/>
-                <w:b/>
-                <w:bCs/>
-              </w:rPr>
-            </w:pPr>
-          </w:p>
-          <w:p>
-            <w:pPr>
-              <w:jc w:val="both"/>
-              <w:rPr>
-                <w:rFonts w:ascii="Calibri" w:hAnsi="Calibri"/>
-                <w:b/>
-                <w:bCs/>
-              </w:rPr>
-            </w:pPr>
-          </w:p>
-          <w:p>
-            <w:pPr>
-              <w:jc w:val="both"/>
-              <w:rPr>
-                <w:rFonts w:ascii="Calibri" w:hAnsi="Calibri"/>
-                <w:b/>
-                <w:bCs/>
-              </w:rPr>
-            </w:pPr>
-          </w:p>
-          <w:p>
-            <w:pPr>
-              <w:jc w:val="both"/>
-              <w:rPr>
-                <w:rFonts w:ascii="Calibri" w:hAnsi="Calibri"/>
-                <w:b/>
-                <w:bCs/>
-              </w:rPr>
-            </w:pPr>
-          </w:p>
-          <w:p>
-            <w:pPr>
-              <w:jc w:val="both"/>
-              <w:rPr>
-                <w:rFonts w:ascii="Calibri" w:hAnsi="Calibri"/>
-                <w:b/>
-                <w:bCs/>
-              </w:rPr>
-            </w:pPr>
-          </w:p>
-          <w:p>
-            <w:pPr>
-              <w:jc w:val="both"/>
-              <w:rPr>
-                <w:rFonts w:ascii="Calibri" w:hAnsi="Calibri"/>
-                <w:b/>
-                <w:bCs/>
-              </w:rPr>
-            </w:pPr>
-          </w:p>
-          <w:p>
-            <w:pPr>
-              <w:jc w:val="both"/>
-              <w:rPr>
                 <w:rFonts w:ascii="Calibri" w:hAnsi="Calibri"/>
                 <w:b/>
                 <w:bCs/>
@@ -1601,93 +2156,6 @@
         </w:tc>
       </w:tr>
     </w:tbl>
-    <w:p>
-      <w:pPr>
-        <w:spacing w:after="0" w:line="360" w:lineRule="auto"/>
-        <w:jc w:val="both"/>
-        <w:rPr>
-          <w:color w:val="595959" w:themeColor="text1" w:themeTint="A6"/>
-          <w:sz w:val="24"/>
-          <w:szCs w:val="24"/>
-          <w:lang w:eastAsia="ja-JP"/>
-        </w:rPr>
-      </w:pPr>
-    </w:p>
-    <w:p/>
-    <w:p/>
-    <w:p/>
-    <w:p>
-      <w:pPr>
-        <w:spacing w:after="0" w:line="360" w:lineRule="auto"/>
-        <w:jc w:val="both"/>
-        <w:rPr>
-          <w:b/>
-          <w:bCs/>
-          <w:sz w:val="24"/>
-          <w:szCs w:val="24"/>
-        </w:rPr>
-      </w:pPr>
-    </w:p>
-    <w:p>
-      <w:pPr>
-        <w:spacing w:after="0" w:line="360" w:lineRule="auto"/>
-        <w:jc w:val="both"/>
-        <w:rPr>
-          <w:b/>
-          <w:bCs/>
-          <w:sz w:val="24"/>
-          <w:szCs w:val="24"/>
-        </w:rPr>
-      </w:pPr>
-    </w:p>
-    <w:p>
-      <w:pPr>
-        <w:spacing w:after="0" w:line="360" w:lineRule="auto"/>
-        <w:jc w:val="both"/>
-        <w:rPr>
-          <w:b/>
-          <w:bCs/>
-          <w:sz w:val="24"/>
-          <w:szCs w:val="24"/>
-        </w:rPr>
-      </w:pPr>
-    </w:p>
-    <w:p>
-      <w:pPr>
-        <w:spacing w:after="0" w:line="360" w:lineRule="auto"/>
-        <w:jc w:val="both"/>
-        <w:rPr>
-          <w:b/>
-          <w:bCs/>
-          <w:sz w:val="24"/>
-          <w:szCs w:val="24"/>
-        </w:rPr>
-      </w:pPr>
-    </w:p>
-    <w:p>
-      <w:pPr>
-        <w:spacing w:after="0" w:line="360" w:lineRule="auto"/>
-        <w:jc w:val="both"/>
-        <w:rPr>
-          <w:b/>
-          <w:bCs/>
-          <w:sz w:val="24"/>
-          <w:szCs w:val="24"/>
-        </w:rPr>
-      </w:pPr>
-    </w:p>
-    <w:p>
-      <w:pPr>
-        <w:spacing w:after="0" w:line="360" w:lineRule="auto"/>
-        <w:jc w:val="both"/>
-        <w:rPr>
-          <w:b/>
-          <w:bCs/>
-          <w:sz w:val="24"/>
-          <w:szCs w:val="24"/>
-        </w:rPr>
-      </w:pPr>
-    </w:p>
     <w:p>
       <w:pPr>
         <w:spacing w:after="0" w:line="360" w:lineRule="auto"/>
@@ -1754,10 +2222,9 @@
             <w:pPr>
               <w:jc w:val="both"/>
               <w:rPr>
-                <w:rFonts w:eastAsiaTheme="majorEastAsia"/>
-                <w:color w:val="767171" w:themeColor="background2" w:themeShade="80"/>
-                <w:sz w:val="24"/>
-                <w:szCs w:val="24"/>
+                <w:rFonts w:ascii="Century Gothic" w:hAnsi="Century Gothic"/>
+                <w:sz w:val="20"/>
+                <w:szCs w:val="20"/>
               </w:rPr>
             </w:pPr>
             <w:r>
@@ -1766,7 +2233,8 @@
                 <w:sz w:val="24"/>
                 <w:szCs w:val="24"/>
               </w:rPr>
-              <w:t>3. A partir de las respuestas anteriores y el perfil de egreso de tu carrera (competencias), responde las siguientes preguntas:</w:t>
+              <w:lastRenderedPageBreak/>
+              <w:t xml:space="preserve">4. Finalmente, piensa en el proyecto que desarrollarás en APT y responde a las siguientes preguntas: </w:t>
             </w:r>
           </w:p>
         </w:tc>
@@ -1820,7 +2288,7 @@
                 <w:sz w:val="24"/>
                 <w:szCs w:val="24"/>
               </w:rPr>
-              <w:t>¿Cuáles son tus principales intereses profesionales? ¿Hay alguna área de desempeño que te interese más?</w:t>
+              <w:t>Los Proyectos APT que ya habías diseñado como plan de trabajo en el curso anterior, ¿se relacionan con tus proyecciones profesionales actuales? ¿cuál se relaciona más? ¿Requiere ajuste?</w:t>
             </w:r>
           </w:p>
           <w:p>
@@ -1847,7 +2315,6 @@
                 <w:rFonts w:eastAsiaTheme="majorEastAsia"/>
                 <w:sz w:val="24"/>
                 <w:szCs w:val="24"/>
-                <w:lang w:val="es-MX"/>
               </w:rPr>
             </w:pPr>
             <w:r>
@@ -1855,9 +2322,8 @@
                 <w:rFonts w:eastAsiaTheme="majorEastAsia"/>
                 <w:sz w:val="24"/>
                 <w:szCs w:val="24"/>
-                <w:lang w:val="es-MX"/>
-              </w:rPr>
-              <w:t xml:space="preserve">Programación web y desarrollo de prototipos, en programación web aprendí bastante y me di cuenta de que me gusta mucho crear la estructura de las páginas web con </w:t>
+              </w:rPr>
+              <w:t xml:space="preserve">Se relaciona directamente con la visión de mi proyecto de título, </w:t>
             </w:r>
             <w:proofErr w:type="spellStart"/>
             <w:r>
@@ -1865,9 +2331,8 @@
                 <w:rFonts w:eastAsiaTheme="majorEastAsia"/>
                 <w:sz w:val="24"/>
                 <w:szCs w:val="24"/>
-                <w:lang w:val="es-MX"/>
-              </w:rPr>
-              <w:t>html</w:t>
+              </w:rPr>
+              <w:t>NutriLink</w:t>
             </w:r>
             <w:proofErr w:type="spellEnd"/>
             <w:r>
@@ -1875,27 +2340,8 @@
                 <w:rFonts w:eastAsiaTheme="majorEastAsia"/>
                 <w:sz w:val="24"/>
                 <w:szCs w:val="24"/>
-                <w:lang w:val="es-MX"/>
-              </w:rPr>
-              <w:t xml:space="preserve"> y darle el comportamiento con otros </w:t>
-            </w:r>
-            <w:r>
-              <w:rPr>
-                <w:rFonts w:eastAsiaTheme="majorEastAsia"/>
-                <w:sz w:val="24"/>
-                <w:szCs w:val="24"/>
-                <w:lang w:val="es-MX"/>
-              </w:rPr>
-              <w:t>lenguajes</w:t>
-            </w:r>
-            <w:r>
-              <w:rPr>
-                <w:rFonts w:eastAsiaTheme="majorEastAsia"/>
-                <w:sz w:val="24"/>
-                <w:szCs w:val="24"/>
-                <w:lang w:val="es-MX"/>
-              </w:rPr>
-              <w:t>, también en el área de bases de datos relacionales me siento segura al realizar operaciones como son las consultas, el modelado de datos...</w:t>
+              </w:rPr>
+              <w:t>. Para mí, el verdadero éxito y la mayor satisfacción personal es haber sido parte de una solución tecnológica que nace para ser un apoyo real en el día a día de los profesionales de la salud.</w:t>
             </w:r>
           </w:p>
           <w:p>
@@ -1906,113 +2352,6 @@
               <w:jc w:val="both"/>
               <w:rPr>
                 <w:rFonts w:eastAsiaTheme="majorEastAsia"/>
-                <w:sz w:val="24"/>
-                <w:szCs w:val="24"/>
-                <w:lang w:val="es-MX"/>
-              </w:rPr>
-            </w:pPr>
-            <w:r>
-              <w:rPr>
-                <w:rFonts w:eastAsiaTheme="majorEastAsia"/>
-                <w:sz w:val="24"/>
-                <w:szCs w:val="24"/>
-                <w:lang w:val="es-MX"/>
-              </w:rPr>
-              <w:t>También me interesa muchísimo el desarrollo de prototipos, en especial la herramienta</w:t>
-            </w:r>
-            <w:r>
-              <w:rPr>
-                <w:rFonts w:eastAsiaTheme="majorEastAsia"/>
-                <w:sz w:val="24"/>
-                <w:szCs w:val="24"/>
-                <w:lang w:val="es-MX"/>
-              </w:rPr>
-              <w:t xml:space="preserve"> </w:t>
-            </w:r>
-            <w:r>
-              <w:rPr>
-                <w:rFonts w:eastAsiaTheme="majorEastAsia"/>
-                <w:sz w:val="24"/>
-                <w:szCs w:val="24"/>
-                <w:lang w:val="es-MX"/>
-              </w:rPr>
-              <w:t>Figma</w:t>
-            </w:r>
-            <w:r>
-              <w:rPr>
-                <w:rFonts w:eastAsiaTheme="majorEastAsia"/>
-                <w:sz w:val="24"/>
-                <w:szCs w:val="24"/>
-                <w:lang w:val="es-MX"/>
-              </w:rPr>
-              <w:t xml:space="preserve">, </w:t>
-            </w:r>
-            <w:r>
-              <w:rPr>
-                <w:rFonts w:eastAsiaTheme="majorEastAsia"/>
-                <w:sz w:val="24"/>
-                <w:szCs w:val="24"/>
-                <w:lang w:val="es-MX"/>
-              </w:rPr>
-              <w:t>considero</w:t>
-            </w:r>
-            <w:r>
-              <w:rPr>
-                <w:rFonts w:eastAsiaTheme="majorEastAsia"/>
-                <w:sz w:val="24"/>
-                <w:szCs w:val="24"/>
-                <w:lang w:val="es-MX"/>
-              </w:rPr>
-              <w:t xml:space="preserve"> que tengo sentido del diseño y a la vez objetividad, pues la idea de crear estos prototipos es basarse en que funciona para el usuario, en proveerle diseños atractivos y que </w:t>
-            </w:r>
-            <w:proofErr w:type="gramStart"/>
-            <w:r>
-              <w:rPr>
-                <w:rFonts w:eastAsiaTheme="majorEastAsia"/>
-                <w:sz w:val="24"/>
-                <w:szCs w:val="24"/>
-                <w:lang w:val="es-MX"/>
-              </w:rPr>
-              <w:t>sean  intuitivos</w:t>
-            </w:r>
-            <w:proofErr w:type="gramEnd"/>
-            <w:r>
-              <w:rPr>
-                <w:rFonts w:eastAsiaTheme="majorEastAsia"/>
-                <w:sz w:val="24"/>
-                <w:szCs w:val="24"/>
-                <w:lang w:val="es-MX"/>
-              </w:rPr>
-              <w:t xml:space="preserve"> para poder ser usados </w:t>
-            </w:r>
-            <w:r>
-              <w:rPr>
-                <w:rFonts w:eastAsiaTheme="majorEastAsia"/>
-                <w:sz w:val="24"/>
-                <w:szCs w:val="24"/>
-                <w:lang w:val="es-MX"/>
-              </w:rPr>
-              <w:t>fácilmente</w:t>
-            </w:r>
-            <w:r>
-              <w:rPr>
-                <w:rFonts w:eastAsiaTheme="majorEastAsia"/>
-                <w:sz w:val="24"/>
-                <w:szCs w:val="24"/>
-                <w:lang w:val="es-MX"/>
-              </w:rPr>
-              <w:t>.</w:t>
-            </w:r>
-          </w:p>
-          <w:p>
-            <w:pPr>
-              <w:tabs>
-                <w:tab w:val="left" w:pos="454"/>
-              </w:tabs>
-              <w:jc w:val="both"/>
-              <w:rPr>
-                <w:rFonts w:eastAsiaTheme="majorEastAsia"/>
-                <w:color w:val="767171" w:themeColor="background2" w:themeShade="80"/>
                 <w:sz w:val="24"/>
                 <w:szCs w:val="24"/>
               </w:rPr>
@@ -2046,560 +2385,6 @@
               <w:jc w:val="both"/>
               <w:rPr>
                 <w:rFonts w:eastAsiaTheme="majorEastAsia"/>
-                <w:b/>
-                <w:bCs/>
-                <w:color w:val="767171" w:themeColor="background2" w:themeShade="80"/>
-                <w:sz w:val="24"/>
-                <w:szCs w:val="24"/>
-              </w:rPr>
-            </w:pPr>
-            <w:r>
-              <w:rPr>
-                <w:rFonts w:eastAsiaTheme="majorEastAsia"/>
-                <w:b/>
-                <w:bCs/>
-                <w:sz w:val="24"/>
-                <w:szCs w:val="24"/>
-              </w:rPr>
-              <w:t>¿Cuáles son las principales competencias que se relacionan con tus intereses profesionales? ¿Hay alguna de ellas que sientas que requieres especialmente fortalecer?</w:t>
-            </w:r>
-          </w:p>
-          <w:p>
-            <w:pPr>
-              <w:pStyle w:val="Prrafodelista"/>
-              <w:tabs>
-                <w:tab w:val="left" w:pos="454"/>
-              </w:tabs>
-              <w:ind w:left="454"/>
-              <w:jc w:val="both"/>
-              <w:rPr>
-                <w:rFonts w:eastAsiaTheme="majorEastAsia"/>
-                <w:b/>
-                <w:bCs/>
-                <w:color w:val="767171" w:themeColor="background2" w:themeShade="80"/>
-                <w:sz w:val="24"/>
-                <w:szCs w:val="24"/>
-              </w:rPr>
-            </w:pPr>
-          </w:p>
-          <w:p>
-            <w:pPr>
-              <w:tabs>
-                <w:tab w:val="left" w:pos="454"/>
-              </w:tabs>
-              <w:jc w:val="both"/>
-              <w:rPr>
-                <w:rFonts w:eastAsiaTheme="majorEastAsia"/>
-                <w:sz w:val="24"/>
-                <w:szCs w:val="24"/>
-              </w:rPr>
-            </w:pPr>
-            <w:r>
-              <w:rPr>
-                <w:rFonts w:eastAsiaTheme="majorEastAsia"/>
-                <w:sz w:val="24"/>
-                <w:szCs w:val="24"/>
-              </w:rPr>
-              <w:t>Las competencias que más se conectan con mis intereses son el Diseño de Soluciones de Software y la Gestión de Bases de Datos, especialmente por cómo se vinculan con el ecosistema Cloud y el sector Fintech, que es donde quiero proyectarme.</w:t>
-            </w:r>
-          </w:p>
-          <w:p>
-            <w:pPr>
-              <w:tabs>
-                <w:tab w:val="left" w:pos="454"/>
-              </w:tabs>
-              <w:jc w:val="both"/>
-              <w:rPr>
-                <w:rFonts w:eastAsiaTheme="majorEastAsia"/>
-                <w:sz w:val="24"/>
-                <w:szCs w:val="24"/>
-              </w:rPr>
-            </w:pPr>
-          </w:p>
-          <w:p>
-            <w:pPr>
-              <w:tabs>
-                <w:tab w:val="left" w:pos="454"/>
-              </w:tabs>
-              <w:jc w:val="both"/>
-              <w:rPr>
-                <w:rFonts w:eastAsiaTheme="majorEastAsia"/>
-                <w:sz w:val="24"/>
-                <w:szCs w:val="24"/>
-              </w:rPr>
-            </w:pPr>
-            <w:r>
-              <w:rPr>
-                <w:rFonts w:eastAsiaTheme="majorEastAsia"/>
-                <w:sz w:val="24"/>
-                <w:szCs w:val="24"/>
-              </w:rPr>
-              <w:t xml:space="preserve">Sin embargo, la competencia que siento que requiero fortalecer especialmente es la de </w:t>
-            </w:r>
-            <w:r>
-              <w:rPr>
-                <w:rFonts w:eastAsiaTheme="majorEastAsia"/>
-                <w:sz w:val="24"/>
-                <w:szCs w:val="24"/>
-              </w:rPr>
-              <w:t xml:space="preserve">Mentalidad emprendedora, no </w:t>
-            </w:r>
-            <w:r>
-              <w:rPr>
-                <w:rFonts w:eastAsiaTheme="majorEastAsia"/>
-                <w:sz w:val="24"/>
-                <w:szCs w:val="24"/>
-              </w:rPr>
-              <w:t>me basta con dominar la parte técnica</w:t>
-            </w:r>
-            <w:r>
-              <w:rPr>
-                <w:rFonts w:eastAsiaTheme="majorEastAsia"/>
-                <w:sz w:val="24"/>
-                <w:szCs w:val="24"/>
-              </w:rPr>
-              <w:t>,</w:t>
-            </w:r>
-            <w:r>
-              <w:rPr>
-                <w:rFonts w:eastAsiaTheme="majorEastAsia"/>
-                <w:sz w:val="24"/>
-                <w:szCs w:val="24"/>
-              </w:rPr>
-              <w:t xml:space="preserve"> necesito aprender a salir de mi zona de confort, tomar decisiones estratégicas sin depender de fórmulas preestablecidas y gestionar un proyecto con la audacia que exige el trabajo independiente.</w:t>
-            </w:r>
-          </w:p>
-          <w:p>
-            <w:pPr>
-              <w:tabs>
-                <w:tab w:val="left" w:pos="454"/>
-              </w:tabs>
-              <w:jc w:val="both"/>
-              <w:rPr>
-                <w:rFonts w:eastAsiaTheme="majorEastAsia"/>
-                <w:color w:val="767171" w:themeColor="background2" w:themeShade="80"/>
-                <w:sz w:val="24"/>
-                <w:szCs w:val="24"/>
-              </w:rPr>
-            </w:pPr>
-          </w:p>
-          <w:p>
-            <w:pPr>
-              <w:tabs>
-                <w:tab w:val="left" w:pos="454"/>
-              </w:tabs>
-              <w:jc w:val="both"/>
-              <w:rPr>
-                <w:rFonts w:eastAsiaTheme="majorEastAsia"/>
-                <w:color w:val="767171" w:themeColor="background2" w:themeShade="80"/>
-                <w:sz w:val="24"/>
-                <w:szCs w:val="24"/>
-              </w:rPr>
-            </w:pPr>
-          </w:p>
-          <w:p>
-            <w:pPr>
-              <w:tabs>
-                <w:tab w:val="left" w:pos="454"/>
-              </w:tabs>
-              <w:jc w:val="both"/>
-              <w:rPr>
-                <w:rFonts w:eastAsiaTheme="majorEastAsia"/>
-                <w:color w:val="767171" w:themeColor="background2" w:themeShade="80"/>
-                <w:sz w:val="24"/>
-                <w:szCs w:val="24"/>
-              </w:rPr>
-            </w:pPr>
-          </w:p>
-          <w:p>
-            <w:pPr>
-              <w:tabs>
-                <w:tab w:val="left" w:pos="454"/>
-              </w:tabs>
-              <w:jc w:val="both"/>
-              <w:rPr>
-                <w:rFonts w:eastAsiaTheme="majorEastAsia"/>
-                <w:color w:val="767171" w:themeColor="background2" w:themeShade="80"/>
-                <w:sz w:val="24"/>
-                <w:szCs w:val="24"/>
-              </w:rPr>
-            </w:pPr>
-          </w:p>
-          <w:p>
-            <w:pPr>
-              <w:tabs>
-                <w:tab w:val="left" w:pos="454"/>
-              </w:tabs>
-              <w:jc w:val="both"/>
-              <w:rPr>
-                <w:rFonts w:eastAsiaTheme="majorEastAsia"/>
-                <w:color w:val="767171" w:themeColor="background2" w:themeShade="80"/>
-                <w:sz w:val="24"/>
-                <w:szCs w:val="24"/>
-              </w:rPr>
-            </w:pPr>
-          </w:p>
-          <w:p>
-            <w:pPr>
-              <w:pStyle w:val="Prrafodelista"/>
-              <w:numPr>
-                <w:ilvl w:val="0"/>
-                <w:numId w:val="12"/>
-              </w:numPr>
-              <w:tabs>
-                <w:tab w:val="left" w:pos="454"/>
-              </w:tabs>
-              <w:ind w:left="454" w:hanging="283"/>
-              <w:jc w:val="both"/>
-              <w:rPr>
-                <w:rFonts w:eastAsiaTheme="majorEastAsia"/>
-                <w:b/>
-                <w:bCs/>
-                <w:color w:val="767171" w:themeColor="background2" w:themeShade="80"/>
-                <w:sz w:val="24"/>
-                <w:szCs w:val="24"/>
-              </w:rPr>
-            </w:pPr>
-            <w:r>
-              <w:rPr>
-                <w:rFonts w:eastAsiaTheme="majorEastAsia"/>
-                <w:b/>
-                <w:bCs/>
-                <w:sz w:val="24"/>
-                <w:szCs w:val="24"/>
-              </w:rPr>
-              <w:lastRenderedPageBreak/>
-              <w:t>¿Cómo te gustaría que fuera tu escenario laboral en 5 años más? ¿Qué te gustaría estar haciendo?</w:t>
-            </w:r>
-          </w:p>
-          <w:p>
-            <w:pPr>
-              <w:tabs>
-                <w:tab w:val="left" w:pos="454"/>
-              </w:tabs>
-              <w:jc w:val="both"/>
-              <w:rPr>
-                <w:rFonts w:eastAsiaTheme="majorEastAsia"/>
-                <w:color w:val="767171" w:themeColor="background2" w:themeShade="80"/>
-                <w:sz w:val="24"/>
-                <w:szCs w:val="24"/>
-              </w:rPr>
-            </w:pPr>
-          </w:p>
-          <w:p>
-            <w:pPr>
-              <w:tabs>
-                <w:tab w:val="left" w:pos="454"/>
-              </w:tabs>
-              <w:jc w:val="both"/>
-              <w:rPr>
-                <w:rFonts w:eastAsiaTheme="majorEastAsia"/>
-                <w:sz w:val="24"/>
-                <w:szCs w:val="24"/>
-              </w:rPr>
-            </w:pPr>
-            <w:r>
-              <w:rPr>
-                <w:rFonts w:eastAsiaTheme="majorEastAsia"/>
-                <w:sz w:val="24"/>
-                <w:szCs w:val="24"/>
-              </w:rPr>
-              <w:t xml:space="preserve">A futuro, quiero desarrollarme en el sector Fintech y profundizar en las áreas que más me apasionan: arquitectura </w:t>
-            </w:r>
-            <w:proofErr w:type="spellStart"/>
-            <w:r>
-              <w:rPr>
-                <w:rFonts w:eastAsiaTheme="majorEastAsia"/>
-                <w:sz w:val="24"/>
-                <w:szCs w:val="24"/>
-              </w:rPr>
-              <w:t>cloud</w:t>
-            </w:r>
-            <w:proofErr w:type="spellEnd"/>
-            <w:r>
-              <w:rPr>
-                <w:rFonts w:eastAsiaTheme="majorEastAsia"/>
-                <w:sz w:val="24"/>
-                <w:szCs w:val="24"/>
-              </w:rPr>
-              <w:t xml:space="preserve">, ciberseguridad, programación, bases de datos y diseño. Mi meta es dominar a fondo una de estas especialidades para aportar con un alto nivel técnico en proyectos de impacto. A largo plazo, busco construir mi camino como </w:t>
-            </w:r>
-            <w:proofErr w:type="spellStart"/>
-            <w:r>
-              <w:rPr>
-                <w:rFonts w:eastAsiaTheme="majorEastAsia"/>
-                <w:sz w:val="24"/>
-                <w:szCs w:val="24"/>
-              </w:rPr>
-              <w:t>freelancer</w:t>
-            </w:r>
-            <w:proofErr w:type="spellEnd"/>
-            <w:r>
-              <w:rPr>
-                <w:rFonts w:eastAsiaTheme="majorEastAsia"/>
-                <w:sz w:val="24"/>
-                <w:szCs w:val="24"/>
-              </w:rPr>
-              <w:t xml:space="preserve">, </w:t>
-            </w:r>
-            <w:r>
-              <w:rPr>
-                <w:rFonts w:eastAsiaTheme="majorEastAsia"/>
-                <w:sz w:val="24"/>
-                <w:szCs w:val="24"/>
-              </w:rPr>
-              <w:t>sé que requiere gran disciplina y trabajo, pero me motiva ser mi propia jefa y dejar una marca de calidad y compromiso en cada proyecto que entregue</w:t>
-            </w:r>
-            <w:r>
-              <w:rPr>
-                <w:rFonts w:eastAsiaTheme="majorEastAsia"/>
-                <w:sz w:val="24"/>
-                <w:szCs w:val="24"/>
-              </w:rPr>
-              <w:t>.</w:t>
-            </w:r>
-          </w:p>
-          <w:p>
-            <w:pPr>
-              <w:jc w:val="both"/>
-              <w:rPr>
-                <w:rFonts w:ascii="Calibri" w:hAnsi="Calibri"/>
-                <w:b/>
-                <w:bCs/>
-                <w:color w:val="1F4E79" w:themeColor="accent1" w:themeShade="80"/>
-              </w:rPr>
-            </w:pPr>
-          </w:p>
-          <w:p>
-            <w:pPr>
-              <w:jc w:val="both"/>
-              <w:rPr>
-                <w:rFonts w:ascii="Calibri" w:hAnsi="Calibri"/>
-                <w:b/>
-                <w:bCs/>
-                <w:color w:val="1F4E79" w:themeColor="accent1" w:themeShade="80"/>
-              </w:rPr>
-            </w:pPr>
-          </w:p>
-        </w:tc>
-      </w:tr>
-    </w:tbl>
-    <w:p>
-      <w:pPr>
-        <w:spacing w:after="0" w:line="360" w:lineRule="auto"/>
-        <w:jc w:val="both"/>
-        <w:rPr>
-          <w:b/>
-          <w:bCs/>
-          <w:sz w:val="24"/>
-          <w:szCs w:val="24"/>
-        </w:rPr>
-      </w:pPr>
-    </w:p>
-    <w:p>
-      <w:pPr>
-        <w:spacing w:after="0" w:line="360" w:lineRule="auto"/>
-        <w:jc w:val="both"/>
-        <w:rPr>
-          <w:b/>
-          <w:bCs/>
-          <w:sz w:val="24"/>
-          <w:szCs w:val="24"/>
-        </w:rPr>
-      </w:pPr>
-    </w:p>
-    <w:tbl>
-      <w:tblPr>
-        <w:tblStyle w:val="Tablaconcuadrcula"/>
-        <w:tblW w:w="0" w:type="auto"/>
-        <w:tblBorders>
-          <w:top w:val="single" w:sz="4" w:space="0" w:color="BFBFBF" w:themeColor="background1" w:themeShade="BF"/>
-          <w:left w:val="single" w:sz="4" w:space="0" w:color="BFBFBF" w:themeColor="background1" w:themeShade="BF"/>
-          <w:bottom w:val="single" w:sz="4" w:space="0" w:color="BFBFBF" w:themeColor="background1" w:themeShade="BF"/>
-          <w:right w:val="single" w:sz="4" w:space="0" w:color="BFBFBF" w:themeColor="background1" w:themeShade="BF"/>
-          <w:insideH w:val="single" w:sz="4" w:space="0" w:color="BFBFBF" w:themeColor="background1" w:themeShade="BF"/>
-          <w:insideV w:val="single" w:sz="4" w:space="0" w:color="BFBFBF" w:themeColor="background1" w:themeShade="BF"/>
-        </w:tblBorders>
-        <w:tblLook w:val="04A0" w:firstRow="1" w:lastRow="0" w:firstColumn="1" w:lastColumn="0" w:noHBand="0" w:noVBand="1"/>
-      </w:tblPr>
-      <w:tblGrid>
-        <w:gridCol w:w="10076"/>
-      </w:tblGrid>
-      <w:tr>
-        <w:trPr>
-          <w:trHeight w:val="440"/>
-        </w:trPr>
-        <w:tc>
-          <w:tcPr>
-            <w:tcW w:w="10076" w:type="dxa"/>
-            <w:vAlign w:val="center"/>
-          </w:tcPr>
-          <w:p>
-            <w:pPr>
-              <w:jc w:val="both"/>
-              <w:rPr>
-                <w:rFonts w:ascii="Century Gothic" w:hAnsi="Century Gothic"/>
-                <w:sz w:val="20"/>
-                <w:szCs w:val="20"/>
-              </w:rPr>
-            </w:pPr>
-            <w:r>
-              <w:rPr>
-                <w:rFonts w:eastAsiaTheme="majorEastAsia"/>
-                <w:sz w:val="24"/>
-                <w:szCs w:val="24"/>
-              </w:rPr>
-              <w:t xml:space="preserve">4. Finalmente, piensa en el proyecto que desarrollarás en APT y responde a las siguientes preguntas: </w:t>
-            </w:r>
-          </w:p>
-        </w:tc>
-      </w:tr>
-      <w:tr>
-        <w:trPr>
-          <w:trHeight w:val="440"/>
-        </w:trPr>
-        <w:tc>
-          <w:tcPr>
-            <w:tcW w:w="10076" w:type="dxa"/>
-            <w:shd w:val="clear" w:color="auto" w:fill="DEEAF6" w:themeFill="accent1" w:themeFillTint="33"/>
-            <w:vAlign w:val="center"/>
-          </w:tcPr>
-          <w:p>
-            <w:pPr>
-              <w:rPr>
-                <w:rFonts w:eastAsiaTheme="majorEastAsia"/>
-                <w:color w:val="767171" w:themeColor="background2" w:themeShade="80"/>
-                <w:sz w:val="24"/>
-                <w:szCs w:val="24"/>
-              </w:rPr>
-            </w:pPr>
-          </w:p>
-          <w:p>
-            <w:pPr>
-              <w:pStyle w:val="Prrafodelista"/>
-              <w:numPr>
-                <w:ilvl w:val="0"/>
-                <w:numId w:val="12"/>
-              </w:numPr>
-              <w:tabs>
-                <w:tab w:val="left" w:pos="454"/>
-              </w:tabs>
-              <w:ind w:left="454" w:hanging="283"/>
-              <w:jc w:val="both"/>
-              <w:rPr>
-                <w:rFonts w:eastAsiaTheme="majorEastAsia"/>
-                <w:b/>
-                <w:bCs/>
-                <w:color w:val="767171" w:themeColor="background2" w:themeShade="80"/>
-                <w:sz w:val="24"/>
-                <w:szCs w:val="24"/>
-              </w:rPr>
-            </w:pPr>
-            <w:r>
-              <w:rPr>
-                <w:rFonts w:eastAsiaTheme="majorEastAsia"/>
-                <w:b/>
-                <w:bCs/>
-                <w:sz w:val="24"/>
-                <w:szCs w:val="24"/>
-              </w:rPr>
-              <w:t>Los Proyectos APT que ya habías diseñado como plan de trabajo en el curso anterior, ¿se relacionan con tus proyecciones profesionales actuales? ¿cuál se relaciona más? ¿Requiere ajuste?</w:t>
-            </w:r>
-          </w:p>
-          <w:p>
-            <w:pPr>
-              <w:tabs>
-                <w:tab w:val="left" w:pos="454"/>
-              </w:tabs>
-              <w:jc w:val="both"/>
-              <w:rPr>
-                <w:rFonts w:eastAsiaTheme="majorEastAsia"/>
-                <w:color w:val="767171" w:themeColor="background2" w:themeShade="80"/>
-                <w:sz w:val="24"/>
-                <w:szCs w:val="24"/>
-              </w:rPr>
-            </w:pPr>
-          </w:p>
-          <w:p>
-            <w:pPr>
-              <w:tabs>
-                <w:tab w:val="left" w:pos="454"/>
-              </w:tabs>
-              <w:jc w:val="both"/>
-              <w:rPr>
-                <w:rFonts w:eastAsiaTheme="majorEastAsia"/>
-                <w:sz w:val="24"/>
-                <w:szCs w:val="24"/>
-              </w:rPr>
-            </w:pPr>
-            <w:r>
-              <w:rPr>
-                <w:rFonts w:eastAsiaTheme="majorEastAsia"/>
-                <w:sz w:val="24"/>
-                <w:szCs w:val="24"/>
-              </w:rPr>
-              <w:t xml:space="preserve">Se relaciona directamente con la visión de mi proyecto de título, </w:t>
-            </w:r>
-            <w:proofErr w:type="spellStart"/>
-            <w:r>
-              <w:rPr>
-                <w:rFonts w:eastAsiaTheme="majorEastAsia"/>
-                <w:sz w:val="24"/>
-                <w:szCs w:val="24"/>
-              </w:rPr>
-              <w:t>NutriLink</w:t>
-            </w:r>
-            <w:proofErr w:type="spellEnd"/>
-            <w:r>
-              <w:rPr>
-                <w:rFonts w:eastAsiaTheme="majorEastAsia"/>
-                <w:sz w:val="24"/>
-                <w:szCs w:val="24"/>
-              </w:rPr>
-              <w:t>. Para mí, el verdadero éxito y la mayor satisfacción personal es haber sido parte de una solución tecnológica que nace para ser un apoyo real en el día a día de los profesionales de la salud, específicamente los nutricionistas.</w:t>
-            </w:r>
-          </w:p>
-          <w:p>
-            <w:pPr>
-              <w:tabs>
-                <w:tab w:val="left" w:pos="454"/>
-              </w:tabs>
-              <w:jc w:val="both"/>
-              <w:rPr>
-                <w:rFonts w:eastAsiaTheme="majorEastAsia"/>
-                <w:sz w:val="24"/>
-                <w:szCs w:val="24"/>
-              </w:rPr>
-            </w:pPr>
-          </w:p>
-          <w:p>
-            <w:pPr>
-              <w:tabs>
-                <w:tab w:val="left" w:pos="454"/>
-              </w:tabs>
-              <w:jc w:val="both"/>
-              <w:rPr>
-                <w:rFonts w:eastAsiaTheme="majorEastAsia"/>
-                <w:color w:val="767171" w:themeColor="background2" w:themeShade="80"/>
-                <w:sz w:val="24"/>
-                <w:szCs w:val="24"/>
-              </w:rPr>
-            </w:pPr>
-          </w:p>
-          <w:p>
-            <w:pPr>
-              <w:pStyle w:val="Prrafodelista"/>
-              <w:numPr>
-                <w:ilvl w:val="0"/>
-                <w:numId w:val="12"/>
-              </w:numPr>
-              <w:tabs>
-                <w:tab w:val="left" w:pos="454"/>
-              </w:tabs>
-              <w:ind w:left="454" w:hanging="283"/>
-              <w:jc w:val="both"/>
-              <w:rPr>
-                <w:rFonts w:eastAsiaTheme="majorEastAsia"/>
                 <w:color w:val="767171" w:themeColor="background2" w:themeShade="80"/>
                 <w:sz w:val="24"/>
                 <w:szCs w:val="24"/>
@@ -2859,9 +2644,9 @@
       </w:pPr>
     </w:p>
     <w:sectPr>
-      <w:headerReference w:type="default" r:id="rId12"/>
-      <w:footerReference w:type="default" r:id="rId13"/>
-      <w:headerReference w:type="first" r:id="rId14"/>
+      <w:headerReference w:type="default" r:id="rId13"/>
+      <w:footerReference w:type="default" r:id="rId14"/>
+      <w:headerReference w:type="first" r:id="rId15"/>
       <w:pgSz w:w="12240" w:h="15840" w:code="1"/>
       <w:pgMar w:top="1440" w:right="1077" w:bottom="1134" w:left="1077" w:header="567" w:footer="465" w:gutter="0"/>
       <w:pgNumType w:start="0"/>
@@ -10066,12 +9851,19 @@
 </file>
 
 <file path=customXml/item1.xml><?xml version="1.0" encoding="utf-8"?>
-<p:properties xmlns:p="http://schemas.microsoft.com/office/2006/metadata/properties" xmlns:xsi="http://www.w3.org/2001/XMLSchema-instance" xmlns:pc="http://schemas.microsoft.com/office/infopath/2007/PartnerControls">
-  <documentManagement/>
-</p:properties>
+<b:Sources xmlns:b="http://schemas.openxmlformats.org/officeDocument/2006/bibliography" xmlns="http://schemas.openxmlformats.org/officeDocument/2006/bibliography" SelectedStyle="\APASixthEditionOfficeOnline.xsl" StyleName="APA" Version="6"/>
 </file>
 
 <file path=customXml/item2.xml><?xml version="1.0" encoding="utf-8"?>
+<?mso-contentType ?>
+<FormTemplates xmlns="http://schemas.microsoft.com/sharepoint/v3/contenttype/forms">
+  <Display>DocumentLibraryForm</Display>
+  <Edit>DocumentLibraryForm</Edit>
+  <New>DocumentLibraryForm</New>
+</FormTemplates>
+</file>
+
+<file path=customXml/item3.xml><?xml version="1.0" encoding="utf-8"?>
 <ct:contentTypeSchema xmlns:ct="http://schemas.microsoft.com/office/2006/metadata/contentType" xmlns:ma="http://schemas.microsoft.com/office/2006/metadata/properties/metaAttributes" ct:_="" ma:_="" ma:contentTypeName="Documento" ma:contentTypeID="0x010100E96778489EE7714D8BD12CC105EB918B" ma:contentTypeVersion="2" ma:contentTypeDescription="Crear nuevo documento." ma:contentTypeScope="" ma:versionID="416c5c7ae9b5d54d83875cd3c65194e3">
   <xsd:schema xmlns:xsd="http://www.w3.org/2001/XMLSchema" xmlns:xs="http://www.w3.org/2001/XMLSchema" xmlns:p="http://schemas.microsoft.com/office/2006/metadata/properties" xmlns:ns2="126e8a1c-9ea9-435a-ac89-d06c80d62e30" targetNamespace="http://schemas.microsoft.com/office/2006/metadata/properties" ma:root="true" ma:fieldsID="70a237c842677bd850644f8595079f5e" ns2:_="">
     <xsd:import namespace="126e8a1c-9ea9-435a-ac89-d06c80d62e30"/>
@@ -10203,29 +9995,29 @@
 </ct:contentTypeSchema>
 </file>
 
-<file path=customXml/item3.xml><?xml version="1.0" encoding="utf-8"?>
-<?mso-contentType ?>
-<FormTemplates xmlns="http://schemas.microsoft.com/sharepoint/v3/contenttype/forms">
-  <Display>DocumentLibraryForm</Display>
-  <Edit>DocumentLibraryForm</Edit>
-  <New>DocumentLibraryForm</New>
-</FormTemplates>
-</file>
-
 <file path=customXml/item4.xml><?xml version="1.0" encoding="utf-8"?>
-<b:Sources xmlns:b="http://schemas.openxmlformats.org/officeDocument/2006/bibliography" xmlns="http://schemas.openxmlformats.org/officeDocument/2006/bibliography" SelectedStyle="\APASixthEditionOfficeOnline.xsl" StyleName="APA" Version="6"/>
+<p:properties xmlns:p="http://schemas.microsoft.com/office/2006/metadata/properties" xmlns:xsi="http://www.w3.org/2001/XMLSchema-instance" xmlns:pc="http://schemas.microsoft.com/office/infopath/2007/PartnerControls">
+  <documentManagement/>
+</p:properties>
 </file>
 
 <file path=customXml/itemProps1.xml><?xml version="1.0" encoding="utf-8"?>
-<ds:datastoreItem xmlns:ds="http://schemas.openxmlformats.org/officeDocument/2006/customXml" ds:itemID="{5F1783E3-BA1C-4CA3-8E32-C9B378BBED03}">
+<ds:datastoreItem xmlns:ds="http://schemas.openxmlformats.org/officeDocument/2006/customXml" ds:itemID="{38798A93-35BB-4E36-97F5-7254B21EAFCC}">
   <ds:schemaRefs>
-    <ds:schemaRef ds:uri="http://schemas.microsoft.com/office/2006/metadata/properties"/>
-    <ds:schemaRef ds:uri="http://schemas.microsoft.com/office/infopath/2007/PartnerControls"/>
+    <ds:schemaRef ds:uri="http://schemas.openxmlformats.org/officeDocument/2006/bibliography"/>
   </ds:schemaRefs>
 </ds:datastoreItem>
 </file>
 
 <file path=customXml/itemProps2.xml><?xml version="1.0" encoding="utf-8"?>
+<ds:datastoreItem xmlns:ds="http://schemas.openxmlformats.org/officeDocument/2006/customXml" ds:itemID="{DABAA964-10BA-4DBC-ABF2-CDEAC0FAF7AA}">
+  <ds:schemaRefs>
+    <ds:schemaRef ds:uri="http://schemas.microsoft.com/sharepoint/v3/contenttype/forms"/>
+  </ds:schemaRefs>
+</ds:datastoreItem>
+</file>
+
+<file path=customXml/itemProps3.xml><?xml version="1.0" encoding="utf-8"?>
 <ds:datastoreItem xmlns:ds="http://schemas.openxmlformats.org/officeDocument/2006/customXml" ds:itemID="{90673534-9590-47F8-B0D6-46AB217CB3AD}">
   <ds:schemaRefs>
     <ds:schemaRef ds:uri="http://schemas.microsoft.com/office/2006/metadata/contentType"/>
@@ -10243,18 +10035,11 @@
 </ds:datastoreItem>
 </file>
 
-<file path=customXml/itemProps3.xml><?xml version="1.0" encoding="utf-8"?>
-<ds:datastoreItem xmlns:ds="http://schemas.openxmlformats.org/officeDocument/2006/customXml" ds:itemID="{DABAA964-10BA-4DBC-ABF2-CDEAC0FAF7AA}">
+<file path=customXml/itemProps4.xml><?xml version="1.0" encoding="utf-8"?>
+<ds:datastoreItem xmlns:ds="http://schemas.openxmlformats.org/officeDocument/2006/customXml" ds:itemID="{5F1783E3-BA1C-4CA3-8E32-C9B378BBED03}">
   <ds:schemaRefs>
-    <ds:schemaRef ds:uri="http://schemas.microsoft.com/sharepoint/v3/contenttype/forms"/>
-  </ds:schemaRefs>
-</ds:datastoreItem>
-</file>
-
-<file path=customXml/itemProps4.xml><?xml version="1.0" encoding="utf-8"?>
-<ds:datastoreItem xmlns:ds="http://schemas.openxmlformats.org/officeDocument/2006/customXml" ds:itemID="{38798A93-35BB-4E36-97F5-7254B21EAFCC}">
-  <ds:schemaRefs>
-    <ds:schemaRef ds:uri="http://schemas.openxmlformats.org/officeDocument/2006/bibliography"/>
+    <ds:schemaRef ds:uri="http://schemas.microsoft.com/office/2006/metadata/properties"/>
+    <ds:schemaRef ds:uri="http://schemas.microsoft.com/office/infopath/2007/PartnerControls"/>
   </ds:schemaRefs>
 </ds:datastoreItem>
 </file>
</xml_diff>